<commit_message>
feat(helm): prove autonomous local host runtime
</commit_message>
<xml_diff>
--- a/deliverables/GUIA_HOST_REPRODUCIBLE_ES.docx
+++ b/deliverables/GUIA_HOST_REPRODUCIBLE_ES.docx
@@ -479,7 +479,7 @@
           <w:spacing w:val="0"/>
           <w:color w:val="181E2A"/>
         </w:rPr>
-        <w:t xml:space="preserve">Instalación real de peer Host1MSP, CouchDB, GW CORE, PostgreSQL e IPFS mediante kind y Helm.</w:t>
+        <w:t xml:space="preserve">Instalación real de peer Host1MSP, CouchDB, GW CORE, PostgreSQL, IPFS y nueve runtimes CCAAS mediante kind y Helm.</w:t>
       </w:r>
     </w:p>
     <w:p>
@@ -507,7 +507,7 @@
           <w:spacing w:val="0"/>
           <w:color w:val="181E2A"/>
         </w:rPr>
-        <w:t xml:space="preserve">Unión del peer Kubernetes a los canales locales y persistencia tras reinicio.</w:t>
+        <w:t xml:space="preserve">Unión del peer Kubernetes a los canales locales, instalación y aprobación de los paquetes CCAAS exactos.</w:t>
       </w:r>
     </w:p>
     <w:p>
@@ -535,6 +535,34 @@
           <w:spacing w:val="0"/>
           <w:color w:val="181E2A"/>
         </w:rPr>
+        <w:t xml:space="preserve">GW dirigido al peer Kubernetes, con persistencia y nueva capacidad de endoso tras reiniciar GW, peer y CCAAS.</w:t>
+      </w:r>
+    </w:p>
+    <w:p>
+      <w:pPr>
+        <w:ind w:left="720" w:first-line="-720"/>
+      </w:pPr>
+      <w:r>
+        <w:rPr>
+          <w:rFonts w:ascii="Arial" w:hAnsi="Arial" w:cs="Arial"/>
+          <w:sz w:val="24"/>
+          <w:sz-cs w:val="24"/>
+          <w:color w:val="181E2A"/>
+        </w:rPr>
+        <w:t xml:space="preserve"/>
+        <w:tab/>
+        <w:t xml:space="preserve">•</w:t>
+        <w:tab/>
+        <w:t xml:space="preserve"/>
+      </w:r>
+      <w:r>
+        <w:rPr>
+          <w:rFonts w:ascii="Arial" w:hAnsi="Arial" w:cs="Arial"/>
+          <w:sz w:val="24"/>
+          <w:sz-cs w:val="24"/>
+          <w:spacing w:val="0"/>
+          <w:color w:val="181E2A"/>
+        </w:rPr>
         <w:t xml:space="preserve">Acceso consentido y controles negativos de acceso no autorizado.</w:t>
       </w:r>
     </w:p>
@@ -549,17 +577,17 @@
           <w:spacing w:val="0"/>
           <w:color w:val="181E2A"/>
         </w:rPr>
-        <w:t xml:space="preserve">Límite que debe declararse:</w:t>
-      </w:r>
-      <w:r>
-        <w:rPr>
-          <w:rFonts w:ascii="Arial" w:hAnsi="Arial" w:cs="Arial"/>
-          <w:sz w:val="24"/>
-          <w:sz-cs w:val="24"/>
-          <w:spacing w:val="0"/>
-          <w:color w:val="181E2A"/>
-        </w:rPr>
-        <w:t xml:space="preserve"> peer y CouchDB ya se ejecutan dentro de Kubernetes y el peer se une realmente a los canales externos. El GW usa todavía el peer Docker que ya dispone de chaincodes. Falta instalar los paquetes CCAAS en el peer kind y repetir el E2E contra ese peer para afirmar que el host Fabric autónomo completo está probado.</w:t>
+        <w:t xml:space="preserve">Separación comprobada:</w:t>
+      </w:r>
+      <w:r>
+        <w:rPr>
+          <w:rFonts w:ascii="Arial" w:hAnsi="Arial" w:cs="Arial"/>
+          <w:sz w:val="24"/>
+          <w:sz-cs w:val="24"/>
+          <w:spacing w:val="0"/>
+          <w:color w:val="181E2A"/>
+        </w:rPr>
+        <w:t xml:space="preserve"> Docker mantiene la ICA de Fabric, el orderer y un peer de referencia como red externa. El peer desplegado por Helm se une a esa red y el GW endosa exclusivamente mediante ese peer Kubernetes; la ruta al peer Docker solo se usa para gossip/bootstrap.</w:t>
       </w:r>
     </w:p>
     <w:p>
@@ -630,7 +658,7 @@
           <w:spacing w:val="0"/>
           <w:color w:val="181E2A"/>
         </w:rPr>
-        <w:t xml:space="preserve">; espera el rollout; realiza operaciones E2E; comprueba canales y CouchDB; consulta PostgreSQL e IPFS dentro de los pods; reinicia GW y peer y comprueba la recuperación. </w:t>
+        <w:t xml:space="preserve">; espera el rollout; realiza operaciones E2E; comprueba canales y CouchDB; consulta PostgreSQL e IPFS dentro de los pods; instala y aprueba los nueve paquetes CCAAS en el peer Kubernetes; ejecuta Consent y SMART mediante ese peer; reinicia GW, peer y CCAAS y comprueba la recuperación. </w:t>
       </w:r>
       <w:r>
         <w:rPr>
@@ -1064,7 +1092,7 @@
           <w:spacing w:val="0"/>
           <w:color w:val="181E2A"/>
         </w:rPr>
-        <w:t xml:space="preserve">La memoria puede afirmar que la red Fabric local y el despliegue Kubernetes con peer, CouchDB, GW CORE, PostgreSQL e IPFS se han probado de forma reproducible. Debe marcar como pendiente el lifecycle CCAAS en el peer kind y el E2E del GW contra ese peer hasta que exista la evidencia correspondiente.</w:t>
+        <w:t xml:space="preserve">La memoria puede afirmar que la red Fabric local y el despliegue Kubernetes con peer, CouchDB, GW CORE, PostgreSQL, IPFS y CCAAS se han probado de forma reproducible, incluido el lifecycle CCAAS y el E2E del GW contra el peer Kubernetes. La promoción a otra red conserva el chart, pero exige nuevas credenciales, Secrets, digests, values y reconciliación gobernada.</w:t>
       </w:r>
     </w:p>
     <w:sectPr/>

</xml_diff>

<commit_message>
feat(host): prove auditable provider onboarding
</commit_message>
<xml_diff>
--- a/deliverables/GUIA_HOST_REPRODUCIBLE_ES.docx
+++ b/deliverables/GUIA_HOST_REPRODUCIBLE_ES.docx
@@ -910,6 +910,61 @@
     </w:p>
     <w:p>
       <w:pPr>
+        <w:spacing w:after="240"/>
+      </w:pPr>
+      <w:r>
+        <w:rPr>
+          <w:rFonts w:ascii="Arial" w:hAnsi="Arial" w:cs="Arial"/>
+          <w:sz w:val="24"/>
+          <w:sz-cs w:val="24"/>
+          <w:spacing w:val="0"/>
+          <w:color w:val="181E2A"/>
+        </w:rPr>
+        <w:t xml:space="preserve">La autorización exige una </w:t>
+      </w:r>
+      <w:r>
+        <w:rPr>
+          <w:rFonts w:ascii="Menlo" w:hAnsi="Menlo" w:cs="Menlo"/>
+          <w:sz w:val="26"/>
+          <w:sz-cs w:val="26"/>
+          <w:spacing w:val="0"/>
+          <w:color w:val="181E2A"/>
+        </w:rPr>
+        <w:t xml:space="preserve">HostingServiceCredential</w:t>
+      </w:r>
+      <w:r>
+        <w:rPr>
+          <w:rFonts w:ascii="Arial" w:hAnsi="Arial" w:cs="Arial"/>
+          <w:sz w:val="24"/>
+          <w:sz-cs w:val="24"/>
+          <w:spacing w:val="0"/>
+          <w:color w:val="181E2A"/>
+        </w:rPr>
+        <w:t xml:space="preserve"> también en local-network y test-network. «Sin PDF» significa que la ICA del espacio de datos puede emitir esa VC para un host preautorizado; no significa omitir la credencial. La ICA de Fabric registra después un identificador limitado a dos enrolamientos, uno MSP y otro TLS. El helper aplica </w:t>
+      </w:r>
+      <w:r>
+        <w:rPr>
+          <w:rFonts w:ascii="Menlo" w:hAnsi="Menlo" w:cs="Menlo"/>
+          <w:sz w:val="26"/>
+          <w:sz-cs w:val="26"/>
+          <w:spacing w:val="0"/>
+          <w:color w:val="181E2A"/>
+        </w:rPr>
+        <w:t xml:space="preserve">issuedAt/expiresAt</w:t>
+      </w:r>
+      <w:r>
+        <w:rPr>
+          <w:rFonts w:ascii="Arial" w:hAnsi="Arial" w:cs="Arial"/>
+          <w:sz w:val="24"/>
+          <w:sz-cs w:val="24"/>
+          <w:spacing w:val="0"/>
+          <w:color w:val="181E2A"/>
+        </w:rPr>
+        <w:t xml:space="preserve">; la autoridad debe revocar el identificador no consumido porque Fabric CA garantiza el límite de usos, no esa fecha.</w:t>
+      </w:r>
+    </w:p>
+    <w:p>
+      <w:pPr>
         <w:spacing w:after="298"/>
       </w:pPr>
       <w:r>
@@ -1093,6 +1148,1171 @@
           <w:color w:val="181E2A"/>
         </w:rPr>
         <w:t xml:space="preserve">La memoria puede afirmar que la red Fabric local y el despliegue Kubernetes con peer, CouchDB, GW CORE, PostgreSQL, IPFS y CCAAS se han probado de forma reproducible, incluido el lifecycle CCAAS y el E2E del GW contra el peer Kubernetes. La promoción a otra red conserva el chart, pero exige nuevas credenciales, Secrets, digests, values y reconciliación gobernada.</w:t>
+      </w:r>
+    </w:p>
+    <w:p>
+      <w:pPr>
+        <w:spacing w:after="298"/>
+      </w:pPr>
+      <w:r>
+        <w:rPr>
+          <w:rFonts w:ascii="Arial" w:hAnsi="Arial" w:cs="Arial"/>
+          <w:sz w:val="36"/>
+          <w:sz-cs w:val="36"/>
+          <w:b/>
+          <w:spacing w:val="0"/>
+          <w:color w:val="15486C"/>
+        </w:rPr>
+        <w:t xml:space="preserve">9. Prueba completa del auditor</w:t>
+      </w:r>
+    </w:p>
+    <w:p>
+      <w:pPr/>
+      <w:r>
+        <w:rPr>
+          <w:rFonts w:ascii="Menlo" w:hAnsi="Menlo" w:cs="Menlo"/>
+          <w:sz w:val="26"/>
+          <w:sz-cs w:val="26"/>
+          <w:spacing w:val="0"/>
+          <w:color w:val="181E2A"/>
+        </w:rPr>
+        <w:t xml:space="preserve">export REPO_ROOT="$(pwd)"</w:t>
+      </w:r>
+    </w:p>
+    <w:p>
+      <w:pPr/>
+      <w:r>
+        <w:rPr>
+          <w:rFonts w:ascii="Menlo" w:hAnsi="Menlo" w:cs="Menlo"/>
+          <w:sz w:val="26"/>
+          <w:sz-cs w:val="26"/>
+          <w:spacing w:val="0"/>
+          <w:color w:val="181E2A"/>
+        </w:rPr>
+        <w:t xml:space="preserve">export DATASPACE_CA_ROOT="/ruta/al/checkout/dataspace-ca-ts"</w:t>
+      </w:r>
+    </w:p>
+    <w:p>
+      <w:pPr/>
+      <w:r>
+        <w:rPr>
+          <w:rFonts w:ascii="Menlo" w:hAnsi="Menlo" w:cs="Menlo"/>
+          <w:sz w:val="26"/>
+          <w:sz-cs w:val="26"/>
+          <w:spacing w:val="0"/>
+          <w:color w:val="181E2A"/>
+        </w:rPr>
+        <w:t xml:space="preserve">export DATASPACE_ICA_ROOT="/ruta/al/checkout/dataspace-ica-ts"</w:t>
+      </w:r>
+    </w:p>
+    <w:p>
+      <w:pPr/>
+      <w:r>
+        <w:rPr>
+          <w:rFonts w:ascii="Menlo" w:hAnsi="Menlo" w:cs="Menlo"/>
+          <w:sz w:val="26"/>
+          <w:sz-cs w:val="26"/>
+          <w:spacing w:val="0"/>
+          <w:color w:val="181E2A"/>
+        </w:rPr>
+        <w:t xml:space="preserve">cd "${REPO_ROOT}"</w:t>
+      </w:r>
+    </w:p>
+    <w:p>
+      <w:pPr/>
+      <w:r>
+        <w:rPr>
+          <w:rFonts w:ascii="Menlo" w:hAnsi="Menlo" w:cs="Menlo"/>
+          <w:sz w:val="26"/>
+          <w:sz-cs w:val="26"/>
+          <w:spacing w:val="0"/>
+          <w:color w:val="181E2A"/>
+        </w:rPr>
+        <w:t xml:space="preserve">npm ci</w:t>
+      </w:r>
+    </w:p>
+    <w:p>
+      <w:pPr/>
+      <w:r>
+        <w:rPr>
+          <w:rFonts w:ascii="Menlo" w:hAnsi="Menlo" w:cs="Menlo"/>
+          <w:sz w:val="26"/>
+          <w:sz-cs w:val="26"/>
+          <w:spacing w:val="0"/>
+          <w:color w:val="181E2A"/>
+        </w:rPr>
+        <w:t xml:space="preserve">release_tag="$(node -p "require('./package.json').version")-$(git rev-parse --short HEAD)"</w:t>
+      </w:r>
+    </w:p>
+    <w:p>
+      <w:pPr/>
+      <w:r>
+        <w:rPr>
+          <w:rFonts w:ascii="Menlo" w:hAnsi="Menlo" w:cs="Menlo"/>
+          <w:sz w:val="26"/>
+          <w:sz-cs w:val="26"/>
+          <w:spacing w:val="0"/>
+          <w:color w:val="181E2A"/>
+        </w:rPr>
+        <w:t xml:space="preserve">export IMAGE_NAME="gw-core:${release_tag}"</w:t>
+      </w:r>
+    </w:p>
+    <w:p>
+      <w:pPr/>
+      <w:r>
+        <w:rPr>
+          <w:rFonts w:ascii="Menlo" w:hAnsi="Menlo" w:cs="Menlo"/>
+          <w:sz w:val="26"/>
+          <w:sz-cs w:val="26"/>
+          <w:spacing w:val="0"/>
+          <w:color w:val="181E2A"/>
+        </w:rPr>
+        <w:t xml:space="preserve">LOCAL_IMAGE_NAME="${IMAGE_NAME}" ./docker_build_local.sh</w:t>
+      </w:r>
+    </w:p>
+    <w:p>
+      <w:pPr/>
+      <w:r>
+        <w:rPr>
+          <w:rFonts w:ascii="Menlo" w:hAnsi="Menlo" w:cs="Menlo"/>
+          <w:sz w:val="26"/>
+          <w:sz-cs w:val="26"/>
+          <w:spacing w:val="0"/>
+          <w:color w:val="181E2A"/>
+        </w:rPr>
+        <w:t xml:space="preserve">npm run evidence:open-source-production-readiness</w:t>
+      </w:r>
+    </w:p>
+    <w:p>
+      <w:pPr>
+        <w:spacing w:after="240"/>
+      </w:pPr>
+      <w:r>
+        <w:rPr>
+          <w:rFonts w:ascii="Arial" w:hAnsi="Arial" w:cs="Arial"/>
+          <w:sz w:val="24"/>
+          <w:sz-cs w:val="24"/>
+          <w:spacing w:val="0"/>
+          <w:color w:val="181E2A"/>
+        </w:rPr>
+        <w:t xml:space="preserve">El auditor conserva el directorio anunciado bajo </w:t>
+      </w:r>
+      <w:r>
+        <w:rPr>
+          <w:rFonts w:ascii="Menlo" w:hAnsi="Menlo" w:cs="Menlo"/>
+          <w:sz w:val="26"/>
+          <w:sz-cs w:val="26"/>
+          <w:spacing w:val="0"/>
+          <w:color w:val="181E2A"/>
+        </w:rPr>
+        <w:t xml:space="preserve">artifacts/open-source-production-readiness/</w:t>
+      </w:r>
+      <w:r>
+        <w:rPr>
+          <w:rFonts w:ascii="Arial" w:hAnsi="Arial" w:cs="Arial"/>
+          <w:sz w:val="24"/>
+          <w:sz-cs w:val="24"/>
+          <w:spacing w:val="0"/>
+          <w:color w:val="181E2A"/>
+        </w:rPr>
+        <w:t xml:space="preserve">, comprueba todos los estados </w:t>
+      </w:r>
+      <w:r>
+        <w:rPr>
+          <w:rFonts w:ascii="Menlo" w:hAnsi="Menlo" w:cs="Menlo"/>
+          <w:sz w:val="26"/>
+          <w:sz-cs w:val="26"/>
+          <w:spacing w:val="0"/>
+          <w:color w:val="181E2A"/>
+        </w:rPr>
+        <w:t xml:space="preserve">PASS</w:t>
+      </w:r>
+      <w:r>
+        <w:rPr>
+          <w:rFonts w:ascii="Arial" w:hAnsi="Arial" w:cs="Arial"/>
+          <w:sz w:val="24"/>
+          <w:sz-cs w:val="24"/>
+          <w:spacing w:val="0"/>
+          <w:color w:val="181E2A"/>
+        </w:rPr>
+        <w:t xml:space="preserve"> y verifica los hashes. Ningún grant, token, PDF, clave, IP o fichero env forma parte de la evidencia pública.</w:t>
+      </w:r>
+    </w:p>
+    <w:p>
+      <w:pPr>
+        <w:spacing w:after="298"/>
+      </w:pPr>
+      <w:r>
+        <w:rPr>
+          <w:rFonts w:ascii="Arial" w:hAnsi="Arial" w:cs="Arial"/>
+          <w:sz w:val="36"/>
+          <w:sz-cs w:val="36"/>
+          <w:b/>
+          <w:spacing w:val="0"/>
+          <w:color w:val="15486C"/>
+        </w:rPr>
+        <w:t xml:space="preserve">10. Fases de autorización y enrolamiento</w:t>
+      </w:r>
+    </w:p>
+    <w:p>
+      <w:pPr>
+        <w:spacing w:after="240"/>
+      </w:pPr>
+      <w:r>
+        <w:rPr>
+          <w:rFonts w:ascii="Arial" w:hAnsi="Arial" w:cs="Arial"/>
+          <w:sz w:val="24"/>
+          <w:sz-cs w:val="24"/>
+          <w:spacing w:val="0"/>
+          <w:color w:val="181E2A"/>
+        </w:rPr>
+        <w:t xml:space="preserve">La autoridad recibe por canal seguro la petición con URL, MSP, Host VC-JWT, decisión firmada, DID públicos, JWKS e inventario gobernado. Ejecuta:</w:t>
+      </w:r>
+    </w:p>
+    <w:p>
+      <w:pPr/>
+      <w:r>
+        <w:rPr>
+          <w:rFonts w:ascii="Menlo" w:hAnsi="Menlo" w:cs="Menlo"/>
+          <w:sz w:val="26"/>
+          <w:sz-cs w:val="26"/>
+          <w:spacing w:val="0"/>
+          <w:color w:val="181E2A"/>
+        </w:rPr>
+        <w:t xml:space="preserve">request_id="$(jq -r '.governanceDecision.decision.requestId' \</w:t>
+      </w:r>
+    </w:p>
+    <w:p>
+      <w:pPr/>
+      <w:r>
+        <w:rPr>
+          <w:rFonts w:ascii="Menlo" w:hAnsi="Menlo" w:cs="Menlo"/>
+          <w:sz w:val="26"/>
+          <w:sz-cs w:val="26"/>
+          <w:spacing w:val="0"/>
+          <w:color w:val="181E2A"/>
+        </w:rPr>
+        <w:t xml:space="preserve">  /secure/approvals/host-enrollment-request.json)"</w:t>
+      </w:r>
+    </w:p>
+    <w:p>
+      <w:pPr/>
+      <w:r>
+        <w:rPr>
+          <w:rFonts w:ascii="Menlo" w:hAnsi="Menlo" w:cs="Menlo"/>
+          <w:sz w:val="26"/>
+          <w:sz-cs w:val="26"/>
+          <w:spacing w:val="0"/>
+          <w:color w:val="181E2A"/>
+        </w:rPr>
+        <w:t xml:space="preserve">node scripts/onboarding/host-onboarding-assistant.mjs \</w:t>
+      </w:r>
+    </w:p>
+    <w:p>
+      <w:pPr/>
+      <w:r>
+        <w:rPr>
+          <w:rFonts w:ascii="Menlo" w:hAnsi="Menlo" w:cs="Menlo"/>
+          <w:sz w:val="26"/>
+          <w:sz-cs w:val="26"/>
+          <w:spacing w:val="0"/>
+          <w:color w:val="181E2A"/>
+        </w:rPr>
+        <w:t xml:space="preserve">  --manifest /secure/onboarding/onboarding.json --role authority</w:t>
+      </w:r>
+    </w:p>
+    <w:p>
+      <w:pPr/>
+      <w:r>
+        <w:rPr>
+          <w:rFonts w:ascii="Menlo" w:hAnsi="Menlo" w:cs="Menlo"/>
+          <w:sz w:val="26"/>
+          <w:sz-cs w:val="26"/>
+          <w:spacing w:val="0"/>
+          <w:color w:val="181E2A"/>
+        </w:rPr>
+        <w:t xml:space="preserve">node scripts/onboarding/host-onboarding-assistant.mjs \</w:t>
+      </w:r>
+    </w:p>
+    <w:p>
+      <w:pPr/>
+      <w:r>
+        <w:rPr>
+          <w:rFonts w:ascii="Menlo" w:hAnsi="Menlo" w:cs="Menlo"/>
+          <w:sz w:val="26"/>
+          <w:sz-cs w:val="26"/>
+          <w:spacing w:val="0"/>
+          <w:color w:val="181E2A"/>
+        </w:rPr>
+        <w:t xml:space="preserve">  --manifest /secure/onboarding/onboarding.json --role authority \</w:t>
+      </w:r>
+    </w:p>
+    <w:p>
+      <w:pPr/>
+      <w:r>
+        <w:rPr>
+          <w:rFonts w:ascii="Menlo" w:hAnsi="Menlo" w:cs="Menlo"/>
+          <w:sz w:val="26"/>
+          <w:sz-cs w:val="26"/>
+          <w:spacing w:val="0"/>
+          <w:color w:val="181E2A"/>
+        </w:rPr>
+        <w:t xml:space="preserve">  --apply --confirm-request "${request_id}"</w:t>
+      </w:r>
+    </w:p>
+    <w:p>
+      <w:pPr>
+        <w:spacing w:after="240"/>
+      </w:pPr>
+      <w:r>
+        <w:rPr>
+          <w:rFonts w:ascii="Arial" w:hAnsi="Arial" w:cs="Arial"/>
+          <w:sz w:val="24"/>
+          <w:sz-cs w:val="24"/>
+          <w:spacing w:val="0"/>
+          <w:color w:val="181E2A"/>
+        </w:rPr>
+        <w:t xml:space="preserve">El proveedor recibe únicamente el grant 0600 y la cadena TLS pública de Fabric CA. Las claves se crean en su infraestructura:</w:t>
+      </w:r>
+    </w:p>
+    <w:p>
+      <w:pPr/>
+      <w:r>
+        <w:rPr>
+          <w:rFonts w:ascii="Menlo" w:hAnsi="Menlo" w:cs="Menlo"/>
+          <w:sz w:val="26"/>
+          <w:sz-cs w:val="26"/>
+          <w:spacing w:val="0"/>
+          <w:color w:val="181E2A"/>
+        </w:rPr>
+        <w:t xml:space="preserve">node scripts/onboarding/host-onboarding-assistant.mjs \</w:t>
+      </w:r>
+    </w:p>
+    <w:p>
+      <w:pPr/>
+      <w:r>
+        <w:rPr>
+          <w:rFonts w:ascii="Menlo" w:hAnsi="Menlo" w:cs="Menlo"/>
+          <w:sz w:val="26"/>
+          <w:sz-cs w:val="26"/>
+          <w:spacing w:val="0"/>
+          <w:color w:val="181E2A"/>
+        </w:rPr>
+        <w:t xml:space="preserve">  --manifest /secure/onboarding/onboarding.json --role host</w:t>
+      </w:r>
+    </w:p>
+    <w:p>
+      <w:pPr/>
+      <w:r>
+        <w:rPr>
+          <w:rFonts w:ascii="Menlo" w:hAnsi="Menlo" w:cs="Menlo"/>
+          <w:sz w:val="26"/>
+          <w:sz-cs w:val="26"/>
+          <w:spacing w:val="0"/>
+          <w:color w:val="181E2A"/>
+        </w:rPr>
+        <w:t xml:space="preserve">node scripts/onboarding/host-onboarding-assistant.mjs \</w:t>
+      </w:r>
+    </w:p>
+    <w:p>
+      <w:pPr/>
+      <w:r>
+        <w:rPr>
+          <w:rFonts w:ascii="Menlo" w:hAnsi="Menlo" w:cs="Menlo"/>
+          <w:sz w:val="26"/>
+          <w:sz-cs w:val="26"/>
+          <w:spacing w:val="0"/>
+          <w:color w:val="181E2A"/>
+        </w:rPr>
+        <w:t xml:space="preserve">  --manifest /secure/onboarding/onboarding.json --role host \</w:t>
+      </w:r>
+    </w:p>
+    <w:p>
+      <w:pPr/>
+      <w:r>
+        <w:rPr>
+          <w:rFonts w:ascii="Menlo" w:hAnsi="Menlo" w:cs="Menlo"/>
+          <w:sz w:val="26"/>
+          <w:sz-cs w:val="26"/>
+          <w:spacing w:val="0"/>
+          <w:color w:val="181E2A"/>
+        </w:rPr>
+        <w:t xml:space="preserve">  --apply --confirm-request "${request_id}"</w:t>
+      </w:r>
+    </w:p>
+    <w:p>
+      <w:pPr/>
+      <w:r>
+        <w:rPr>
+          <w:rFonts w:ascii="Menlo" w:hAnsi="Menlo" w:cs="Menlo"/>
+          <w:sz w:val="26"/>
+          <w:sz-cs w:val="26"/>
+          <w:spacing w:val="0"/>
+          <w:color w:val="181E2A"/>
+        </w:rPr>
+        <w:t xml:space="preserve">cd /secure/host/helm-runtime</w:t>
+      </w:r>
+    </w:p>
+    <w:p>
+      <w:pPr/>
+      <w:r>
+        <w:rPr>
+          <w:rFonts w:ascii="Menlo" w:hAnsi="Menlo" w:cs="Menlo"/>
+          <w:sz w:val="26"/>
+          <w:sz-cs w:val="26"/>
+          <w:spacing w:val="0"/>
+          <w:color w:val="181E2A"/>
+        </w:rPr>
+        <w:t xml:space="preserve">shasum -a 256 -c manifest.sha256</w:t>
+      </w:r>
+    </w:p>
+    <w:p>
+      <w:pPr>
+        <w:spacing w:after="240"/>
+      </w:pPr>
+      <w:r>
+        <w:rPr>
+          <w:rFonts w:ascii="Arial" w:hAnsi="Arial" w:cs="Arial"/>
+          <w:sz w:val="24"/>
+          <w:sz-cs w:val="24"/>
+          <w:spacing w:val="0"/>
+          <w:color w:val="181E2A"/>
+        </w:rPr>
+        <w:t xml:space="preserve">El paquete resultante contiene solo </w:t>
+      </w:r>
+      <w:r>
+        <w:rPr>
+          <w:rFonts w:ascii="Menlo" w:hAnsi="Menlo" w:cs="Menlo"/>
+          <w:sz w:val="26"/>
+          <w:sz-cs w:val="26"/>
+          <w:spacing w:val="0"/>
+          <w:color w:val="181E2A"/>
+        </w:rPr>
+        <w:t xml:space="preserve">msp.tgz</w:t>
+      </w:r>
+      <w:r>
+        <w:rPr>
+          <w:rFonts w:ascii="Arial" w:hAnsi="Arial" w:cs="Arial"/>
+          <w:sz w:val="24"/>
+          <w:sz-cs w:val="24"/>
+          <w:spacing w:val="0"/>
+          <w:color w:val="181E2A"/>
+        </w:rPr>
+        <w:t xml:space="preserve">, </w:t>
+      </w:r>
+      <w:r>
+        <w:rPr>
+          <w:rFonts w:ascii="Menlo" w:hAnsi="Menlo" w:cs="Menlo"/>
+          <w:sz w:val="26"/>
+          <w:sz-cs w:val="26"/>
+          <w:spacing w:val="0"/>
+          <w:color w:val="181E2A"/>
+        </w:rPr>
+        <w:t xml:space="preserve">tls.tgz</w:t>
+      </w:r>
+      <w:r>
+        <w:rPr>
+          <w:rFonts w:ascii="Arial" w:hAnsi="Arial" w:cs="Arial"/>
+          <w:sz w:val="24"/>
+          <w:sz-cs w:val="24"/>
+          <w:spacing w:val="0"/>
+          <w:color w:val="181E2A"/>
+        </w:rPr>
+        <w:t xml:space="preserve">, </w:t>
+      </w:r>
+      <w:r>
+        <w:rPr>
+          <w:rFonts w:ascii="Menlo" w:hAnsi="Menlo" w:cs="Menlo"/>
+          <w:sz w:val="26"/>
+          <w:sz-cs w:val="26"/>
+          <w:spacing w:val="0"/>
+          <w:color w:val="181E2A"/>
+        </w:rPr>
+        <w:t xml:space="preserve">authorization.json</w:t>
+      </w:r>
+      <w:r>
+        <w:rPr>
+          <w:rFonts w:ascii="Arial" w:hAnsi="Arial" w:cs="Arial"/>
+          <w:sz w:val="24"/>
+          <w:sz-cs w:val="24"/>
+          <w:spacing w:val="0"/>
+          <w:color w:val="181E2A"/>
+        </w:rPr>
+        <w:t xml:space="preserve"> y </w:t>
+      </w:r>
+      <w:r>
+        <w:rPr>
+          <w:rFonts w:ascii="Menlo" w:hAnsi="Menlo" w:cs="Menlo"/>
+          <w:sz w:val="26"/>
+          <w:sz-cs w:val="26"/>
+          <w:spacing w:val="0"/>
+          <w:color w:val="181E2A"/>
+        </w:rPr>
+        <w:t xml:space="preserve">manifest.sha256</w:t>
+      </w:r>
+      <w:r>
+        <w:rPr>
+          <w:rFonts w:ascii="Arial" w:hAnsi="Arial" w:cs="Arial"/>
+          <w:sz w:val="24"/>
+          <w:sz-cs w:val="24"/>
+          <w:spacing w:val="0"/>
+          <w:color w:val="181E2A"/>
+        </w:rPr>
+        <w:t xml:space="preserve">.</w:t>
+      </w:r>
+    </w:p>
+    <w:p>
+      <w:pPr>
+        <w:spacing w:after="298"/>
+      </w:pPr>
+      <w:r>
+        <w:rPr>
+          <w:rFonts w:ascii="Arial" w:hAnsi="Arial" w:cs="Arial"/>
+          <w:sz w:val="36"/>
+          <w:sz-cs w:val="36"/>
+          <w:b/>
+          <w:spacing w:val="0"/>
+          <w:color w:val="15486C"/>
+        </w:rPr>
+        <w:t xml:space="preserve">11. Imagen OCI, values y package IDs</w:t>
+      </w:r>
+    </w:p>
+    <w:p>
+      <w:pPr/>
+      <w:r>
+        <w:rPr>
+          <w:rFonts w:ascii="Menlo" w:hAnsi="Menlo" w:cs="Menlo"/>
+          <w:sz w:val="26"/>
+          <w:sz-cs w:val="26"/>
+          <w:spacing w:val="0"/>
+          <w:color w:val="181E2A"/>
+        </w:rPr>
+        <w:t xml:space="preserve">docker build -t "${OCI_REPOSITORY}/gw-core:${release_tag}" .</w:t>
+      </w:r>
+    </w:p>
+    <w:p>
+      <w:pPr/>
+      <w:r>
+        <w:rPr>
+          <w:rFonts w:ascii="Menlo" w:hAnsi="Menlo" w:cs="Menlo"/>
+          <w:sz w:val="26"/>
+          <w:sz-cs w:val="26"/>
+          <w:spacing w:val="0"/>
+          <w:color w:val="181E2A"/>
+        </w:rPr>
+        <w:t xml:space="preserve">docker push "${OCI_REPOSITORY}/gw-core:${release_tag}"</w:t>
+      </w:r>
+    </w:p>
+    <w:p>
+      <w:pPr/>
+      <w:r>
+        <w:rPr>
+          <w:rFonts w:ascii="Menlo" w:hAnsi="Menlo" w:cs="Menlo"/>
+          <w:sz w:val="26"/>
+          <w:sz-cs w:val="26"/>
+          <w:spacing w:val="0"/>
+          <w:color w:val="181E2A"/>
+        </w:rPr>
+        <w:t xml:space="preserve">docker buildx imagetools inspect "${OCI_REPOSITORY}/gw-core:${release_tag}"</w:t>
+      </w:r>
+    </w:p>
+    <w:p>
+      <w:pPr>
+        <w:spacing w:after="240"/>
+      </w:pPr>
+      <w:r>
+        <w:rPr>
+          <w:rFonts w:ascii="Arial" w:hAnsi="Arial" w:cs="Arial"/>
+          <w:sz w:val="24"/>
+          <w:sz-cs w:val="24"/>
+          <w:spacing w:val="0"/>
+          <w:color w:val="181E2A"/>
+        </w:rPr>
+        <w:t xml:space="preserve">GW CORE es un servicio y no se publica en npm. El values usa el digest OCI. Cada CCAAS necesita una imagen por digest y un paquete cuya dirección sea el Service exacto del release. El package ID es </w:t>
+      </w:r>
+      <w:r>
+        <w:rPr>
+          <w:rFonts w:ascii="Menlo" w:hAnsi="Menlo" w:cs="Menlo"/>
+          <w:sz w:val="26"/>
+          <w:sz-cs w:val="26"/>
+          <w:spacing w:val="0"/>
+          <w:color w:val="181E2A"/>
+        </w:rPr>
+        <w:t xml:space="preserve">&lt;label&gt;:&lt;sha256 del .tgz&gt;</w:t>
+      </w:r>
+      <w:r>
+        <w:rPr>
+          <w:rFonts w:ascii="Arial" w:hAnsi="Arial" w:cs="Arial"/>
+          <w:sz w:val="24"/>
+          <w:sz-cs w:val="24"/>
+          <w:spacing w:val="0"/>
+          <w:color w:val="181E2A"/>
+        </w:rPr>
+        <w:t xml:space="preserve">; cualquier cambio de Service, release, puerto o TLS obliga a regenerarlo.</w:t>
+      </w:r>
+    </w:p>
+    <w:p>
+      <w:pPr/>
+      <w:r>
+        <w:rPr>
+          <w:rFonts w:ascii="Menlo" w:hAnsi="Menlo" w:cs="Menlo"/>
+          <w:sz w:val="26"/>
+          <w:sz-cs w:val="26"/>
+          <w:spacing w:val="0"/>
+          <w:color w:val="181E2A"/>
+        </w:rPr>
+        <w:t xml:space="preserve">HOST_FULLNAME="${HELM_RELEASE}" \</w:t>
+      </w:r>
+    </w:p>
+    <w:p>
+      <w:pPr/>
+      <w:r>
+        <w:rPr>
+          <w:rFonts w:ascii="Menlo" w:hAnsi="Menlo" w:cs="Menlo"/>
+          <w:sz w:val="26"/>
+          <w:sz-cs w:val="26"/>
+          <w:spacing w:val="0"/>
+          <w:color w:val="181E2A"/>
+        </w:rPr>
+        <w:t xml:space="preserve">KUBE_NAMESPACE="${KUBE_NAMESPACE}" \</w:t>
+      </w:r>
+    </w:p>
+    <w:p>
+      <w:pPr/>
+      <w:r>
+        <w:rPr>
+          <w:rFonts w:ascii="Menlo" w:hAnsi="Menlo" w:cs="Menlo"/>
+          <w:sz w:val="26"/>
+          <w:sz-cs w:val="26"/>
+          <w:spacing w:val="0"/>
+          <w:color w:val="181E2A"/>
+        </w:rPr>
+        <w:t xml:space="preserve">CCAAS_IMAGE="${OCI_REPOSITORY}/host-runtime@sha256:&lt;digest&gt;" \</w:t>
+      </w:r>
+    </w:p>
+    <w:p>
+      <w:pPr/>
+      <w:r>
+        <w:rPr>
+          <w:rFonts w:ascii="Menlo" w:hAnsi="Menlo" w:cs="Menlo"/>
+          <w:sz w:val="26"/>
+          <w:sz-cs w:val="26"/>
+          <w:spacing w:val="0"/>
+          <w:color w:val="181E2A"/>
+        </w:rPr>
+        <w:t xml:space="preserve">CCAAS_OUTPUT_DIR=/secure/onboarding/ccaas \</w:t>
+      </w:r>
+    </w:p>
+    <w:p>
+      <w:pPr/>
+      <w:r>
+        <w:rPr>
+          <w:rFonts w:ascii="Menlo" w:hAnsi="Menlo" w:cs="Menlo"/>
+          <w:sz w:val="26"/>
+          <w:sz-cs w:val="26"/>
+          <w:spacing w:val="0"/>
+          <w:color w:val="181E2A"/>
+        </w:rPr>
+        <w:t xml:space="preserve">  bash scripts/onboarding/prepare-ccaas-packages.sh</w:t>
+      </w:r>
+    </w:p>
+    <w:p>
+      <w:pPr/>
+      <w:r>
+        <w:rPr>
+          <w:rFonts w:ascii="Menlo" w:hAnsi="Menlo" w:cs="Menlo"/>
+          <w:sz w:val="26"/>
+          <w:sz-cs w:val="26"/>
+          <w:spacing w:val="0"/>
+          <w:color w:val="181E2A"/>
+        </w:rPr>
+        <w:t xml:space="preserve">shasum -a 256 -c /secure/onboarding/ccaas/manifest.sha256</w:t>
+      </w:r>
+    </w:p>
+    <w:p>
+      <w:pPr>
+        <w:spacing w:after="240"/>
+      </w:pPr>
+      <w:r>
+        <w:rPr>
+          <w:rFonts w:ascii="Arial" w:hAnsi="Arial" w:cs="Arial"/>
+          <w:sz w:val="24"/>
+          <w:sz-cs w:val="24"/>
+          <w:spacing w:val="0"/>
+          <w:color w:val="181E2A"/>
+        </w:rPr>
+        <w:t xml:space="preserve">El resultado contiene nueve archivos, sus package IDs en </w:t>
+      </w:r>
+      <w:r>
+        <w:rPr>
+          <w:rFonts w:ascii="Menlo" w:hAnsi="Menlo" w:cs="Menlo"/>
+          <w:sz w:val="26"/>
+          <w:sz-cs w:val="26"/>
+          <w:spacing w:val="0"/>
+          <w:color w:val="181E2A"/>
+        </w:rPr>
+        <w:t xml:space="preserve">manifest.tsv</w:t>
+      </w:r>
+      <w:r>
+        <w:rPr>
+          <w:rFonts w:ascii="Arial" w:hAnsi="Arial" w:cs="Arial"/>
+          <w:sz w:val="24"/>
+          <w:sz-cs w:val="24"/>
+          <w:spacing w:val="0"/>
+          <w:color w:val="181E2A"/>
+        </w:rPr>
+        <w:t xml:space="preserve"> y el fragmento </w:t>
+      </w:r>
+      <w:r>
+        <w:rPr>
+          <w:rFonts w:ascii="Menlo" w:hAnsi="Menlo" w:cs="Menlo"/>
+          <w:sz w:val="26"/>
+          <w:sz-cs w:val="26"/>
+          <w:spacing w:val="0"/>
+          <w:color w:val="181E2A"/>
+        </w:rPr>
+        <w:t xml:space="preserve">chaincodes.values.yaml</w:t>
+      </w:r>
+      <w:r>
+        <w:rPr>
+          <w:rFonts w:ascii="Arial" w:hAnsi="Arial" w:cs="Arial"/>
+          <w:sz w:val="24"/>
+          <w:sz-cs w:val="24"/>
+          <w:spacing w:val="0"/>
+          <w:color w:val="181E2A"/>
+        </w:rPr>
+        <w:t xml:space="preserve">.</w:t>
+      </w:r>
+    </w:p>
+    <w:p>
+      <w:pPr>
+        <w:spacing w:after="298"/>
+      </w:pPr>
+      <w:r>
+        <w:rPr>
+          <w:rFonts w:ascii="Arial" w:hAnsi="Arial" w:cs="Arial"/>
+          <w:sz w:val="36"/>
+          <w:sz-cs w:val="36"/>
+          <w:b/>
+          <w:spacing w:val="0"/>
+          <w:color w:val="15486C"/>
+        </w:rPr>
+        <w:t xml:space="preserve">12. Secrets e instalación Kubernetes</w:t>
+      </w:r>
+    </w:p>
+    <w:p>
+      <w:pPr/>
+      <w:r>
+        <w:rPr>
+          <w:rFonts w:ascii="Menlo" w:hAnsi="Menlo" w:cs="Menlo"/>
+          <w:sz w:val="26"/>
+          <w:sz-cs w:val="26"/>
+          <w:spacing w:val="0"/>
+          <w:color w:val="181E2A"/>
+        </w:rPr>
+        <w:t xml:space="preserve">export KUBE_CONTEXT="contexto-del-cluster"</w:t>
+      </w:r>
+    </w:p>
+    <w:p>
+      <w:pPr/>
+      <w:r>
+        <w:rPr>
+          <w:rFonts w:ascii="Menlo" w:hAnsi="Menlo" w:cs="Menlo"/>
+          <w:sz w:val="26"/>
+          <w:sz-cs w:val="26"/>
+          <w:spacing w:val="0"/>
+          <w:color w:val="181E2A"/>
+        </w:rPr>
+        <w:t xml:space="preserve">export KUBE_NAMESPACE="namespace-del-host"</w:t>
+      </w:r>
+    </w:p>
+    <w:p>
+      <w:pPr/>
+      <w:r>
+        <w:rPr>
+          <w:rFonts w:ascii="Menlo" w:hAnsi="Menlo" w:cs="Menlo"/>
+          <w:sz w:val="26"/>
+          <w:sz-cs w:val="26"/>
+          <w:spacing w:val="0"/>
+          <w:color w:val="181E2A"/>
+        </w:rPr>
+        <w:t xml:space="preserve">export HELM_RELEASE="nombre-del-host"</w:t>
+      </w:r>
+    </w:p>
+    <w:p>
+      <w:pPr/>
+      <w:r>
+        <w:rPr>
+          <w:rFonts w:ascii="Menlo" w:hAnsi="Menlo" w:cs="Menlo"/>
+          <w:sz w:val="26"/>
+          <w:sz-cs w:val="26"/>
+          <w:spacing w:val="0"/>
+          <w:color w:val="181E2A"/>
+        </w:rPr>
+        <w:t xml:space="preserve">kubectl --context "${KUBE_CONTEXT}" create namespace "${KUBE_NAMESPACE}"</w:t>
+      </w:r>
+    </w:p>
+    <w:p>
+      <w:pPr/>
+      <w:r>
+        <w:rPr>
+          <w:rFonts w:ascii="Menlo" w:hAnsi="Menlo" w:cs="Menlo"/>
+          <w:sz w:val="26"/>
+          <w:sz-cs w:val="26"/>
+          <w:spacing w:val="0"/>
+          <w:color w:val="181E2A"/>
+        </w:rPr>
+        <w:t xml:space="preserve">HOST_RUNTIME_DIR=/secure/host/helm-runtime \</w:t>
+      </w:r>
+    </w:p>
+    <w:p>
+      <w:pPr/>
+      <w:r>
+        <w:rPr>
+          <w:rFonts w:ascii="Menlo" w:hAnsi="Menlo" w:cs="Menlo"/>
+          <w:sz w:val="26"/>
+          <w:sz-cs w:val="26"/>
+          <w:spacing w:val="0"/>
+          <w:color w:val="181E2A"/>
+        </w:rPr>
+        <w:t xml:space="preserve">POSTGRES_SECRET_ENV_FILE=/secure/host/postgresql.env \</w:t>
+      </w:r>
+    </w:p>
+    <w:p>
+      <w:pPr/>
+      <w:r>
+        <w:rPr>
+          <w:rFonts w:ascii="Menlo" w:hAnsi="Menlo" w:cs="Menlo"/>
+          <w:sz w:val="26"/>
+          <w:sz-cs w:val="26"/>
+          <w:spacing w:val="0"/>
+          <w:color w:val="181E2A"/>
+        </w:rPr>
+        <w:t xml:space="preserve">COUCHDB_SECRET_ENV_FILE=/secure/host/couchdb.env \</w:t>
+      </w:r>
+    </w:p>
+    <w:p>
+      <w:pPr/>
+      <w:r>
+        <w:rPr>
+          <w:rFonts w:ascii="Menlo" w:hAnsi="Menlo" w:cs="Menlo"/>
+          <w:sz w:val="26"/>
+          <w:sz-cs w:val="26"/>
+          <w:spacing w:val="0"/>
+          <w:color w:val="181E2A"/>
+        </w:rPr>
+        <w:t xml:space="preserve">GW_SECRET_ENV_FILE=/secure/host/gw.env \</w:t>
+      </w:r>
+    </w:p>
+    <w:p>
+      <w:pPr/>
+      <w:r>
+        <w:rPr>
+          <w:rFonts w:ascii="Menlo" w:hAnsi="Menlo" w:cs="Menlo"/>
+          <w:sz w:val="26"/>
+          <w:sz-cs w:val="26"/>
+          <w:spacing w:val="0"/>
+          <w:color w:val="181E2A"/>
+        </w:rPr>
+        <w:t xml:space="preserve">REDIS_SECRET_ENV_FILE=/secure/host/redis.env \</w:t>
+      </w:r>
+    </w:p>
+    <w:p>
+      <w:pPr/>
+      <w:r>
+        <w:rPr>
+          <w:rFonts w:ascii="Menlo" w:hAnsi="Menlo" w:cs="Menlo"/>
+          <w:sz w:val="26"/>
+          <w:sz-cs w:val="26"/>
+          <w:spacing w:val="0"/>
+          <w:color w:val="181E2A"/>
+        </w:rPr>
+        <w:t xml:space="preserve">  bash scripts/onboarding/materialize-kubernetes-secrets.sh</w:t>
+      </w:r>
+    </w:p>
+    <w:p>
+      <w:pPr/>
+      <w:r>
+        <w:rPr>
+          <w:rFonts w:ascii="Menlo" w:hAnsi="Menlo" w:cs="Menlo"/>
+          <w:sz w:val="26"/>
+          <w:sz-cs w:val="26"/>
+          <w:spacing w:val="0"/>
+          <w:color w:val="181E2A"/>
+        </w:rPr>
+        <w:t xml:space="preserve">bash scripts/validate-host-helm-values.sh \</w:t>
+      </w:r>
+    </w:p>
+    <w:p>
+      <w:pPr/>
+      <w:r>
+        <w:rPr>
+          <w:rFonts w:ascii="Menlo" w:hAnsi="Menlo" w:cs="Menlo"/>
+          <w:sz w:val="26"/>
+          <w:sz-cs w:val="26"/>
+          <w:spacing w:val="0"/>
+          <w:color w:val="181E2A"/>
+        </w:rPr>
+        <w:t xml:space="preserve">  /secure/inventory/host.values.yaml "${KUBE_NAMESPACE}" "${HELM_RELEASE}"</w:t>
+      </w:r>
+    </w:p>
+    <w:p>
+      <w:pPr/>
+      <w:r>
+        <w:rPr>
+          <w:rFonts w:ascii="Menlo" w:hAnsi="Menlo" w:cs="Menlo"/>
+          <w:sz w:val="26"/>
+          <w:sz-cs w:val="26"/>
+          <w:spacing w:val="0"/>
+          <w:color w:val="181E2A"/>
+        </w:rPr>
+        <w:t xml:space="preserve">helm upgrade --install "${HELM_RELEASE}" charts/gdc-host \</w:t>
+      </w:r>
+    </w:p>
+    <w:p>
+      <w:pPr/>
+      <w:r>
+        <w:rPr>
+          <w:rFonts w:ascii="Menlo" w:hAnsi="Menlo" w:cs="Menlo"/>
+          <w:sz w:val="26"/>
+          <w:sz-cs w:val="26"/>
+          <w:spacing w:val="0"/>
+          <w:color w:val="181E2A"/>
+        </w:rPr>
+        <w:t xml:space="preserve">  --kube-context "${KUBE_CONTEXT}" --namespace "${KUBE_NAMESPACE}" \</w:t>
+      </w:r>
+    </w:p>
+    <w:p>
+      <w:pPr/>
+      <w:r>
+        <w:rPr>
+          <w:rFonts w:ascii="Menlo" w:hAnsi="Menlo" w:cs="Menlo"/>
+          <w:sz w:val="26"/>
+          <w:sz-cs w:val="26"/>
+          <w:spacing w:val="0"/>
+          <w:color w:val="181E2A"/>
+        </w:rPr>
+        <w:t xml:space="preserve">  --values /secure/inventory/host.values.yaml \</w:t>
+      </w:r>
+    </w:p>
+    <w:p>
+      <w:pPr/>
+      <w:r>
+        <w:rPr>
+          <w:rFonts w:ascii="Menlo" w:hAnsi="Menlo" w:cs="Menlo"/>
+          <w:sz w:val="26"/>
+          <w:sz-cs w:val="26"/>
+          <w:spacing w:val="0"/>
+          <w:color w:val="181E2A"/>
+        </w:rPr>
+        <w:t xml:space="preserve">  --atomic --wait --timeout 15m</w:t>
+      </w:r>
+    </w:p>
+    <w:p>
+      <w:pPr>
+        <w:spacing w:after="240"/>
+      </w:pPr>
+      <w:r>
+        <w:rPr>
+          <w:rFonts w:ascii="Arial" w:hAnsi="Arial" w:cs="Arial"/>
+          <w:sz w:val="24"/>
+          <w:sz-cs w:val="24"/>
+          <w:spacing w:val="0"/>
+          <w:color w:val="181E2A"/>
+        </w:rPr>
+        <w:t xml:space="preserve">Se materializan seis Secrets básicos —peer MSP, peer TLS, autorización, PostgreSQL, CouchDB y GW— y un séptimo si Redis está habilitado. Los values nunca contienen sus valores. En producción cada pod desenvuelve una vez la KEK mediante el adaptador KMS; una KEK plana solo es válida en local/demo.</w:t>
+      </w:r>
+    </w:p>
+    <w:p>
+      <w:pPr>
+        <w:spacing w:after="298"/>
+      </w:pPr>
+      <w:r>
+        <w:rPr>
+          <w:rFonts w:ascii="Arial" w:hAnsi="Arial" w:cs="Arial"/>
+          <w:sz w:val="36"/>
+          <w:sz-cs w:val="36"/>
+          <w:b/>
+          <w:spacing w:val="0"/>
+          <w:color w:val="15486C"/>
+        </w:rPr>
+        <w:t xml:space="preserve">13. Reconciliación y aceptación</w:t>
+      </w:r>
+    </w:p>
+    <w:p>
+      <w:pPr/>
+      <w:r>
+        <w:rPr>
+          <w:rFonts w:ascii="Menlo" w:hAnsi="Menlo" w:cs="Menlo"/>
+          <w:sz w:val="26"/>
+          <w:sz-cs w:val="26"/>
+          <w:spacing w:val="0"/>
+          <w:color w:val="181E2A"/>
+        </w:rPr>
+        <w:t xml:space="preserve">node scripts/onboarding/host-onboarding-assistant.mjs \</w:t>
+      </w:r>
+    </w:p>
+    <w:p>
+      <w:pPr/>
+      <w:r>
+        <w:rPr>
+          <w:rFonts w:ascii="Menlo" w:hAnsi="Menlo" w:cs="Menlo"/>
+          <w:sz w:val="26"/>
+          <w:sz-cs w:val="26"/>
+          <w:spacing w:val="0"/>
+          <w:color w:val="181E2A"/>
+        </w:rPr>
+        <w:t xml:space="preserve">  --manifest /secure/onboarding/onboarding.json --role platform</w:t>
+      </w:r>
+    </w:p>
+    <w:p>
+      <w:pPr/>
+      <w:r>
+        <w:rPr>
+          <w:rFonts w:ascii="Menlo" w:hAnsi="Menlo" w:cs="Menlo"/>
+          <w:sz w:val="26"/>
+          <w:sz-cs w:val="26"/>
+          <w:spacing w:val="0"/>
+          <w:color w:val="181E2A"/>
+        </w:rPr>
+        <w:t xml:space="preserve">node scripts/onboarding/host-onboarding-assistant.mjs \</w:t>
+      </w:r>
+    </w:p>
+    <w:p>
+      <w:pPr/>
+      <w:r>
+        <w:rPr>
+          <w:rFonts w:ascii="Menlo" w:hAnsi="Menlo" w:cs="Menlo"/>
+          <w:sz w:val="26"/>
+          <w:sz-cs w:val="26"/>
+          <w:spacing w:val="0"/>
+          <w:color w:val="181E2A"/>
+        </w:rPr>
+        <w:t xml:space="preserve">  --manifest /secure/onboarding/onboarding.json --role platform \</w:t>
+      </w:r>
+    </w:p>
+    <w:p>
+      <w:pPr/>
+      <w:r>
+        <w:rPr>
+          <w:rFonts w:ascii="Menlo" w:hAnsi="Menlo" w:cs="Menlo"/>
+          <w:sz w:val="26"/>
+          <w:sz-cs w:val="26"/>
+          <w:spacing w:val="0"/>
+          <w:color w:val="181E2A"/>
+        </w:rPr>
+        <w:t xml:space="preserve">  --apply --confirm-request "${request_id}"</w:t>
+      </w:r>
+    </w:p>
+    <w:p>
+      <w:pPr/>
+      <w:r>
+        <w:rPr>
+          <w:rFonts w:ascii="Menlo" w:hAnsi="Menlo" w:cs="Menlo"/>
+          <w:sz w:val="26"/>
+          <w:sz-cs w:val="26"/>
+          <w:spacing w:val="0"/>
+          <w:color w:val="181E2A"/>
+        </w:rPr>
+        <w:t xml:space="preserve">kubectl --context "${KUBE_CONTEXT}" -n "${KUBE_NAMESPACE}" get pods,pvc,svc</w:t>
+      </w:r>
+    </w:p>
+    <w:p>
+      <w:pPr/>
+      <w:r>
+        <w:rPr>
+          <w:rFonts w:ascii="Menlo" w:hAnsi="Menlo" w:cs="Menlo"/>
+          <w:sz w:val="26"/>
+          <w:sz-cs w:val="26"/>
+          <w:spacing w:val="0"/>
+          <w:color w:val="181E2A"/>
+        </w:rPr>
+        <w:t xml:space="preserve">kubectl --context "${KUBE_CONTEXT}" -n "${KUBE_NAMESPACE}" rollout status \</w:t>
+      </w:r>
+    </w:p>
+    <w:p>
+      <w:pPr/>
+      <w:r>
+        <w:rPr>
+          <w:rFonts w:ascii="Menlo" w:hAnsi="Menlo" w:cs="Menlo"/>
+          <w:sz w:val="26"/>
+          <w:sz-cs w:val="26"/>
+          <w:spacing w:val="0"/>
+          <w:color w:val="181E2A"/>
+        </w:rPr>
+        <w:t xml:space="preserve">  statefulset/"${HELM_RELEASE}"-peer --timeout=5m</w:t>
+      </w:r>
+    </w:p>
+    <w:p>
+      <w:pPr/>
+      <w:r>
+        <w:rPr>
+          <w:rFonts w:ascii="Menlo" w:hAnsi="Menlo" w:cs="Menlo"/>
+          <w:sz w:val="26"/>
+          <w:sz-cs w:val="26"/>
+          <w:spacing w:val="0"/>
+          <w:color w:val="181E2A"/>
+        </w:rPr>
+        <w:t xml:space="preserve">kubectl --context "${KUBE_CONTEXT}" -n "${KUBE_NAMESPACE}" rollout status \</w:t>
+      </w:r>
+    </w:p>
+    <w:p>
+      <w:pPr/>
+      <w:r>
+        <w:rPr>
+          <w:rFonts w:ascii="Menlo" w:hAnsi="Menlo" w:cs="Menlo"/>
+          <w:sz w:val="26"/>
+          <w:sz-cs w:val="26"/>
+          <w:spacing w:val="0"/>
+          <w:color w:val="181E2A"/>
+        </w:rPr>
+        <w:t xml:space="preserve">  deployment/"${HELM_RELEASE}"-gw --timeout=5m</w:t>
+      </w:r>
+    </w:p>
+    <w:p>
+      <w:pPr>
+        <w:spacing w:after="240"/>
+      </w:pPr>
+      <w:r>
+        <w:rPr>
+          <w:rFonts w:ascii="Arial" w:hAnsi="Arial" w:cs="Arial"/>
+          <w:sz w:val="24"/>
+          <w:sz-cs w:val="24"/>
+          <w:spacing w:val="0"/>
+          <w:color w:val="181E2A"/>
+        </w:rPr>
+        <w:t xml:space="preserve">El mapa privado del operador contiene comandos reales de inspección y aplicación para MSP, grants, peer, canales y lifecycle CCAAS. Si falta uno, el reconciliador falla cerrado. La aceptación prueba escritura/lectura por el peer propio, permiso/denegación y persistencia tras reiniciar GW, peer y CCAAS; un pod arrancado no basta.</w:t>
+      </w:r>
+    </w:p>
+    <w:p>
+      <w:pPr>
+        <w:spacing w:after="298"/>
+      </w:pPr>
+      <w:r>
+        <w:rPr>
+          <w:rFonts w:ascii="Arial" w:hAnsi="Arial" w:cs="Arial"/>
+          <w:sz w:val="36"/>
+          <w:sz-cs w:val="36"/>
+          <w:b/>
+          <w:spacing w:val="0"/>
+          <w:color w:val="15486C"/>
+        </w:rPr>
+        <w:t xml:space="preserve">14. Material que se entrega</w:t>
+      </w:r>
+    </w:p>
+    <w:p>
+      <w:pPr>
+        <w:spacing w:after="240"/>
+      </w:pPr>
+      <w:r>
+        <w:rPr>
+          <w:rFonts w:ascii="Arial" w:hAnsi="Arial" w:cs="Arial"/>
+          <w:sz w:val="24"/>
+          <w:sz-cs w:val="24"/>
+          <w:spacing w:val="0"/>
+          <w:color w:val="181E2A"/>
+        </w:rPr>
+        <w:t xml:space="preserve">Commit, digest OCI, chart, values saneado, versiones, gates, logs saneados, auditoría y manifiesto de hashes. Los datos reales del proveedor se mantienen en un anexo privado. La prueba local demuestra reproducibilidad del software; no declara desplegada una infraestructura externa concreta.</w:t>
       </w:r>
     </w:p>
     <w:sectPr/>

</xml_diff>

<commit_message>
feat(host): close auditable Kubernetes onboarding gaps
</commit_message>
<xml_diff>
--- a/deliverables/GUIA_HOST_REPRODUCIBLE_ES.docx
+++ b/deliverables/GUIA_HOST_REPRODUCIBLE_ES.docx
@@ -479,7 +479,7 @@
           <w:spacing w:val="0"/>
           <w:color w:val="181E2A"/>
         </w:rPr>
-        <w:t xml:space="preserve">Instalación real de peer Host1MSP, CouchDB, GW CORE, PostgreSQL, IPFS y nueve runtimes CCAAS mediante kind y Helm.</w:t>
+        <w:t xml:space="preserve">Instalación real mediante kind y Helm de un peer del Host2MSP recién admitido, CouchDB, GW CORE, PostgreSQL, IPFS y nueve runtimes CCAAS.</w:t>
       </w:r>
     </w:p>
     <w:p>
@@ -535,7 +535,7 @@
           <w:spacing w:val="0"/>
           <w:color w:val="181E2A"/>
         </w:rPr>
-        <w:t xml:space="preserve">GW dirigido al peer Kubernetes, con persistencia y nueva capacidad de endoso tras reiniciar GW, peer y CCAAS.</w:t>
+        <w:t xml:space="preserve">La misma Host VC queda vinculada a los certificados del peer y del cliente GW; GW firma como Host2MSP y se dirige al peer Kubernetes de ese MSP, con persistencia y nueva capacidad de endoso tras reiniciar GW, peer y CCAAS.</w:t>
       </w:r>
     </w:p>
     <w:p>
@@ -940,7 +940,7 @@
           <w:spacing w:val="0"/>
           <w:color w:val="181E2A"/>
         </w:rPr>
-        <w:t xml:space="preserve"> también en local-network y test-network. «Sin PDF» significa que la ICA del espacio de datos puede emitir esa VC para un host preautorizado; no significa omitir la credencial. La ICA de Fabric registra después un identificador limitado a dos enrolamientos, uno MSP y otro TLS. El helper aplica </w:t>
+        <w:t xml:space="preserve"> también en local-network y test-network. «Sin PDF» significa que la ICA del espacio de datos puede emitir esa VC para un host preautorizado; no significa omitir la credencial. La ICA de Fabric registra después un identificador limitado a dos enrolamientos, uno MSP y otro TLS, y otro identificador de un solo uso para la identidad cliente del GW. Las tres claves privadas se generan dentro del host. El helper aplica </w:t>
       </w:r>
       <w:r>
         <w:rPr>

</xml_diff>

<commit_message>
docs: complete governed host provider handoff
</commit_message>
<xml_diff>
--- a/deliverables/GUIA_HOST_REPRODUCIBLE_ES.docx
+++ b/deliverables/GUIA_HOST_REPRODUCIBLE_ES.docx
@@ -1535,6 +1535,73 @@
           <w:spacing w:val="0"/>
           <w:color w:val="181E2A"/>
         </w:rPr>
+        <w:t xml:space="preserve">La ICA de Fabric se usa para altas, renovaciones y revocaciones, no para el tráfico normal de peers y orderers. La autoridad puede publicar una ventana TLS limitada a la IP de salida del proveedor y cerrarla después. El proveedor recibe URL, nombre de CA y cadena pública, pero nunca la identidad registradora de la ICA de Fabric. Antes del enrolamiento verifica:</w:t>
+      </w:r>
+    </w:p>
+    <w:p>
+      <w:pPr/>
+      <w:r>
+        <w:rPr>
+          <w:rFonts w:ascii="Menlo" w:hAnsi="Menlo" w:cs="Menlo"/>
+          <w:sz w:val="26"/>
+          <w:sz-cs w:val="26"/>
+          <w:spacing w:val="0"/>
+          <w:color w:val="181E2A"/>
+        </w:rPr>
+        <w:t xml:space="preserve">fabric-ca-client getcainfo \</w:t>
+      </w:r>
+    </w:p>
+    <w:p>
+      <w:pPr/>
+      <w:r>
+        <w:rPr>
+          <w:rFonts w:ascii="Menlo" w:hAnsi="Menlo" w:cs="Menlo"/>
+          <w:sz w:val="26"/>
+          <w:sz-cs w:val="26"/>
+          <w:spacing w:val="0"/>
+          <w:color w:val="181E2A"/>
+        </w:rPr>
+        <w:t xml:space="preserve">  -u "${FABRIC_CA_URL}" \</w:t>
+      </w:r>
+    </w:p>
+    <w:p>
+      <w:pPr/>
+      <w:r>
+        <w:rPr>
+          <w:rFonts w:ascii="Menlo" w:hAnsi="Menlo" w:cs="Menlo"/>
+          <w:sz w:val="26"/>
+          <w:sz-cs w:val="26"/>
+          <w:spacing w:val="0"/>
+          <w:color w:val="181E2A"/>
+        </w:rPr>
+        <w:t xml:space="preserve">  --caname "${FABRIC_CA_NAME}" \</w:t>
+      </w:r>
+    </w:p>
+    <w:p>
+      <w:pPr/>
+      <w:r>
+        <w:rPr>
+          <w:rFonts w:ascii="Menlo" w:hAnsi="Menlo" w:cs="Menlo"/>
+          <w:sz w:val="26"/>
+          <w:sz-cs w:val="26"/>
+          <w:spacing w:val="0"/>
+          <w:color w:val="181E2A"/>
+        </w:rPr>
+        <w:t xml:space="preserve">  --tls.certfiles "${FABRIC_CA_TLS_CERTFILES}"</w:t>
+      </w:r>
+    </w:p>
+    <w:p>
+      <w:pPr>
+        <w:spacing w:after="240"/>
+      </w:pPr>
+      <w:r>
+        <w:rPr>
+          <w:rFonts w:ascii="Arial" w:hAnsi="Arial" w:cs="Arial"/>
+          <w:sz w:val="24"/>
+          <w:sz-cs w:val="24"/>
+          <w:spacing w:val="0"/>
+          <w:color w:val="181E2A"/>
+        </w:rPr>
         <w:t xml:space="preserve">La autoridad recibe por canal seguro la petición con URL, MSP, Host VC-JWT, decisión firmada, DID públicos, JWKS e inventario gobernado. Ejecuta:</w:t>
       </w:r>
     </w:p>
@@ -1733,6 +1800,138 @@
           <w:color w:val="181E2A"/>
         </w:rPr>
         <w:t xml:space="preserve">shasum -a 256 -c manifest.sha256</w:t>
+      </w:r>
+    </w:p>
+    <w:p>
+      <w:pPr>
+        <w:spacing w:after="240"/>
+      </w:pPr>
+      <w:r>
+        <w:rPr>
+          <w:rFonts w:ascii="Arial" w:hAnsi="Arial" w:cs="Arial"/>
+          <w:sz w:val="24"/>
+          <w:sz-cs w:val="24"/>
+          <w:spacing w:val="0"/>
+          <w:color w:val="181E2A"/>
+        </w:rPr>
+        <w:t xml:space="preserve">Para auditar los dos enrolamientos por separado se usan los mismos helpers con variables explícitas:</w:t>
+      </w:r>
+    </w:p>
+    <w:p>
+      <w:pPr/>
+      <w:r>
+        <w:rPr>
+          <w:rFonts w:ascii="Menlo" w:hAnsi="Menlo" w:cs="Menlo"/>
+          <w:sz w:val="26"/>
+          <w:sz-cs w:val="26"/>
+          <w:spacing w:val="0"/>
+          <w:color w:val="181E2A"/>
+        </w:rPr>
+        <w:t xml:space="preserve">ENROLLMENT_GRANT_FILE=/secure/grants/peer-grant.json \</w:t>
+      </w:r>
+    </w:p>
+    <w:p>
+      <w:pPr/>
+      <w:r>
+        <w:rPr>
+          <w:rFonts w:ascii="Menlo" w:hAnsi="Menlo" w:cs="Menlo"/>
+          <w:sz w:val="26"/>
+          <w:sz-cs w:val="26"/>
+          <w:spacing w:val="0"/>
+          <w:color w:val="181E2A"/>
+        </w:rPr>
+        <w:t xml:space="preserve">HOST_MSP_OUTPUT_DIR=/secure/host/fabric-peer \</w:t>
+      </w:r>
+    </w:p>
+    <w:p>
+      <w:pPr/>
+      <w:r>
+        <w:rPr>
+          <w:rFonts w:ascii="Menlo" w:hAnsi="Menlo" w:cs="Menlo"/>
+          <w:sz w:val="26"/>
+          <w:sz-cs w:val="26"/>
+          <w:spacing w:val="0"/>
+          <w:color w:val="181E2A"/>
+        </w:rPr>
+        <w:t xml:space="preserve">HOST_PEER_DNS="${HOST_PEER_DNS}" \</w:t>
+      </w:r>
+    </w:p>
+    <w:p>
+      <w:pPr/>
+      <w:r>
+        <w:rPr>
+          <w:rFonts w:ascii="Menlo" w:hAnsi="Menlo" w:cs="Menlo"/>
+          <w:sz w:val="26"/>
+          <w:sz-cs w:val="26"/>
+          <w:spacing w:val="0"/>
+          <w:color w:val="181E2A"/>
+        </w:rPr>
+        <w:t xml:space="preserve">CA_TLS_CERT=/secure/trust/fabric-ica-ca-chain.pem \</w:t>
+      </w:r>
+    </w:p>
+    <w:p>
+      <w:pPr/>
+      <w:r>
+        <w:rPr>
+          <w:rFonts w:ascii="Menlo" w:hAnsi="Menlo" w:cs="Menlo"/>
+          <w:sz w:val="26"/>
+          <w:sz-cs w:val="26"/>
+          <w:spacing w:val="0"/>
+          <w:color w:val="181E2A"/>
+        </w:rPr>
+        <w:t xml:space="preserve">  bash scripts/enrollment/enroll-host-msp.sh</w:t>
+      </w:r>
+    </w:p>
+    <w:p>
+      <w:pPr/>
+      <w:r>
+        <w:rPr>
+          <w:rFonts w:ascii="Menlo" w:hAnsi="Menlo" w:cs="Menlo"/>
+          <w:sz w:val="26"/>
+          <w:sz-cs w:val="26"/>
+          <w:spacing w:val="0"/>
+          <w:color w:val="181E2A"/>
+        </w:rPr>
+        <w:t xml:space="preserve">ENROLLMENT_GRANT_FILE=/secure/grants/gw-client-grant.json \</w:t>
+      </w:r>
+    </w:p>
+    <w:p>
+      <w:pPr/>
+      <w:r>
+        <w:rPr>
+          <w:rFonts w:ascii="Menlo" w:hAnsi="Menlo" w:cs="Menlo"/>
+          <w:sz w:val="26"/>
+          <w:sz-cs w:val="26"/>
+          <w:spacing w:val="0"/>
+          <w:color w:val="181E2A"/>
+        </w:rPr>
+        <w:t xml:space="preserve">HOST_CLIENT_OUTPUT_DIR=/secure/host/fabric-gw-client \</w:t>
+      </w:r>
+    </w:p>
+    <w:p>
+      <w:pPr/>
+      <w:r>
+        <w:rPr>
+          <w:rFonts w:ascii="Menlo" w:hAnsi="Menlo" w:cs="Menlo"/>
+          <w:sz w:val="26"/>
+          <w:sz-cs w:val="26"/>
+          <w:spacing w:val="0"/>
+          <w:color w:val="181E2A"/>
+        </w:rPr>
+        <w:t xml:space="preserve">CA_TLS_CERT=/secure/trust/fabric-ica-ca-chain.pem \</w:t>
+      </w:r>
+    </w:p>
+    <w:p>
+      <w:pPr/>
+      <w:r>
+        <w:rPr>
+          <w:rFonts w:ascii="Menlo" w:hAnsi="Menlo" w:cs="Menlo"/>
+          <w:sz w:val="26"/>
+          <w:sz-cs w:val="26"/>
+          <w:spacing w:val="0"/>
+          <w:color w:val="181E2A"/>
+        </w:rPr>
+        <w:t xml:space="preserve">  bash scripts/enrollment/enroll-host-client.sh</w:t>
       </w:r>
     </w:p>
     <w:p>
@@ -1856,6 +2055,47 @@
           <w:spacing w:val="0"/>
           <w:color w:val="181E2A"/>
         </w:rPr>
+        <w:t xml:space="preserve">helm pull oci://ghcr.io/global-datacare/gdc-host --version 0.3.0</w:t>
+      </w:r>
+    </w:p>
+    <w:p>
+      <w:pPr/>
+      <w:r>
+        <w:rPr>
+          <w:rFonts w:ascii="Menlo" w:hAnsi="Menlo" w:cs="Menlo"/>
+          <w:sz w:val="26"/>
+          <w:sz-cs w:val="26"/>
+          <w:spacing w:val="0"/>
+          <w:color w:val="181E2A"/>
+        </w:rPr>
+        <w:t xml:space="preserve">helm show chart oci://ghcr.io/global-datacare/gdc-host --version 0.3.0</w:t>
+      </w:r>
+    </w:p>
+    <w:p>
+      <w:pPr>
+        <w:spacing w:after="240"/>
+      </w:pPr>
+      <w:r>
+        <w:rPr>
+          <w:rFonts w:ascii="Arial" w:hAnsi="Arial" w:cs="Arial"/>
+          <w:sz w:val="24"/>
+          <w:sz-cs w:val="24"/>
+          <w:spacing w:val="0"/>
+          <w:color w:val="181E2A"/>
+        </w:rPr>
+        <w:t xml:space="preserve">El chart OCI es el mismo artefacto validado en local-network. Los values, Secrets, grants, MSP/TLS y package IDs se generan de nuevo para cada entorno.</w:t>
+      </w:r>
+    </w:p>
+    <w:p>
+      <w:pPr/>
+      <w:r>
+        <w:rPr>
+          <w:rFonts w:ascii="Menlo" w:hAnsi="Menlo" w:cs="Menlo"/>
+          <w:sz w:val="26"/>
+          <w:sz-cs w:val="26"/>
+          <w:spacing w:val="0"/>
+          <w:color w:val="181E2A"/>
+        </w:rPr>
         <w:t xml:space="preserve">export GW_PUBLIC_IMAGE="ghcr.io/global-datacare/gw-core@sha256:6b37c7dfea17dc2ee42628c5467fb5b44fe7f669536e695bd4f2932714485e5f"</w:t>
       </w:r>
     </w:p>
@@ -2274,7 +2514,33 @@
           <w:spacing w:val="0"/>
           <w:color w:val="181E2A"/>
         </w:rPr>
-        <w:t xml:space="preserve">helm upgrade --install "${HELM_RELEASE}" charts/gdc-host \</w:t>
+        <w:t xml:space="preserve">helm pull oci://ghcr.io/global-datacare/gdc-host --version 0.3.0</w:t>
+      </w:r>
+    </w:p>
+    <w:p>
+      <w:pPr/>
+      <w:r>
+        <w:rPr>
+          <w:rFonts w:ascii="Menlo" w:hAnsi="Menlo" w:cs="Menlo"/>
+          <w:sz w:val="26"/>
+          <w:sz-cs w:val="26"/>
+          <w:spacing w:val="0"/>
+          <w:color w:val="181E2A"/>
+        </w:rPr>
+        <w:t xml:space="preserve">tar -xzf gdc-host-0.3.0.tgz -C /secure/onboarding</w:t>
+      </w:r>
+    </w:p>
+    <w:p>
+      <w:pPr/>
+      <w:r>
+        <w:rPr>
+          <w:rFonts w:ascii="Menlo" w:hAnsi="Menlo" w:cs="Menlo"/>
+          <w:sz w:val="26"/>
+          <w:sz-cs w:val="26"/>
+          <w:spacing w:val="0"/>
+          <w:color w:val="181E2A"/>
+        </w:rPr>
+        <w:t xml:space="preserve">helm upgrade --install "${HELM_RELEASE}" /secure/onboarding/gdc-host \</w:t>
       </w:r>
     </w:p>
     <w:p>

</xml_diff>

<commit_message>
docs: include ICA migration evidence gate
</commit_message>
<xml_diff>
--- a/deliverables/GUIA_HOST_REPRODUCIBLE_ES.docx
+++ b/deliverables/GUIA_HOST_REPRODUCIBLE_ES.docx
@@ -1505,6 +1505,41 @@
           <w:color w:val="181E2A"/>
         </w:rPr>
         <w:t xml:space="preserve"> y verifica los hashes. Ningún grant, token, PDF, clave, IP o fichero env forma parte de la evidencia pública.</w:t>
+      </w:r>
+    </w:p>
+    <w:p>
+      <w:pPr>
+        <w:spacing w:after="240"/>
+      </w:pPr>
+      <w:r>
+        <w:rPr>
+          <w:rFonts w:ascii="Arial" w:hAnsi="Arial" w:cs="Arial"/>
+          <w:sz w:val="24"/>
+          <w:sz-cs w:val="24"/>
+          <w:spacing w:val="0"/>
+          <w:color w:val="181E2A"/>
+        </w:rPr>
+        <w:t xml:space="preserve">La puerta </w:t>
+      </w:r>
+      <w:r>
+        <w:rPr>
+          <w:rFonts w:ascii="Menlo" w:hAnsi="Menlo" w:cs="Menlo"/>
+          <w:sz w:val="26"/>
+          <w:sz-cs w:val="26"/>
+          <w:spacing w:val="0"/>
+          <w:color w:val="181E2A"/>
+        </w:rPr>
+        <w:t xml:space="preserve">21-dataspace-ica-postgres-ipfs-migration</w:t>
+      </w:r>
+      <w:r>
+        <w:rPr>
+          <w:rFonts w:ascii="Arial" w:hAnsi="Arial" w:cs="Arial"/>
+          <w:sz w:val="24"/>
+          <w:sz-cs w:val="24"/>
+          <w:spacing w:val="0"/>
+          <w:color w:val="181E2A"/>
+        </w:rPr>
+        <w:t xml:space="preserve"> ejecuta el migrador open source de Firestore/GCS a PostgreSQL/IPFS contra Firestore Emulator, PostgreSQL y Kubo reales. Utiliza solo datos sintéticos, relee los registros y CIDs migrados, exige cero referencias GCS pendientes y compara los digests de origen transformado y destino. Los documentos firmados, datos personales y claves reales nunca se publican.</w:t>
       </w:r>
     </w:p>
     <w:p>

</xml_diff>

<commit_message>
docs: pin public GW CORE 1.23.7 image
</commit_message>
<xml_diff>
--- a/deliverables/GUIA_HOST_REPRODUCIBLE_ES.docx
+++ b/deliverables/GUIA_HOST_REPRODUCIBLE_ES.docx
@@ -116,7 +116,7 @@
           <w:spacing w:val="0"/>
           <w:color w:val="181E2A"/>
         </w:rPr>
-        <w:t xml:space="preserve">ghcr.io/global-datacare/gw-core@sha256:6b37c7dfea17dc2ee42628c5467fb5b44fe7f669536e695bd4f2932714485e5f</w:t>
+        <w:t xml:space="preserve">ghcr.io/global-datacare/gw-core@sha256:cebed0ecfd7e509ec26974fb9808a79ade6355fa7bd786c5694babd2ce3300c5</w:t>
       </w:r>
       <w:r>
         <w:rPr>
@@ -2131,7 +2131,7 @@
           <w:spacing w:val="0"/>
           <w:color w:val="181E2A"/>
         </w:rPr>
-        <w:t xml:space="preserve">export GW_PUBLIC_IMAGE="ghcr.io/global-datacare/gw-core@sha256:6b37c7dfea17dc2ee42628c5467fb5b44fe7f669536e695bd4f2932714485e5f"</w:t>
+        <w:t xml:space="preserve">export GW_PUBLIC_IMAGE="ghcr.io/global-datacare/gw-core@sha256:cebed0ecfd7e509ec26974fb9808a79ade6355fa7bd786c5694babd2ce3300c5"</w:t>
       </w:r>
     </w:p>
     <w:p>

</xml_diff>

<commit_message>
docs: pin GW CORE 1.23.9 OCI digest
</commit_message>
<xml_diff>
--- a/deliverables/GUIA_HOST_REPRODUCIBLE_ES.docx
+++ b/deliverables/GUIA_HOST_REPRODUCIBLE_ES.docx
@@ -116,7 +116,7 @@
           <w:spacing w:val="0"/>
           <w:color w:val="181E2A"/>
         </w:rPr>
-        <w:t xml:space="preserve">ghcr.io/global-datacare/gw-core@sha256:cebed0ecfd7e509ec26974fb9808a79ade6355fa7bd786c5694babd2ce3300c5</w:t>
+        <w:t xml:space="preserve">ghcr.io/global-datacare/gw-core@sha256:3c2c4eade8123d7e3b1a40fc5d32864dd685603dcbe09a9e44393f60864a626f</w:t>
       </w:r>
       <w:r>
         <w:rPr>
@@ -2131,7 +2131,7 @@
           <w:spacing w:val="0"/>
           <w:color w:val="181E2A"/>
         </w:rPr>
-        <w:t xml:space="preserve">export GW_PUBLIC_IMAGE="ghcr.io/global-datacare/gw-core@sha256:cebed0ecfd7e509ec26974fb9808a79ade6355fa7bd786c5694babd2ce3300c5"</w:t>
+        <w:t xml:space="preserve">export GW_PUBLIC_IMAGE="ghcr.io/global-datacare/gw-core@sha256:3c2c4eade8123d7e3b1a40fc5d32864dd685603dcbe09a9e44393f60864a626f"</w:t>
       </w:r>
     </w:p>
     <w:p>

</xml_diff>

<commit_message>
docs: pin public GW CORE 1.23.13 image
</commit_message>
<xml_diff>
--- a/deliverables/GUIA_HOST_REPRODUCIBLE_ES.docx
+++ b/deliverables/GUIA_HOST_REPRODUCIBLE_ES.docx
@@ -116,7 +116,7 @@
           <w:spacing w:val="0"/>
           <w:color w:val="181E2A"/>
         </w:rPr>
-        <w:t xml:space="preserve">ghcr.io/global-datacare/gw-core@sha256:3c2c4eade8123d7e3b1a40fc5d32864dd685603dcbe09a9e44393f60864a626f</w:t>
+        <w:t xml:space="preserve">ghcr.io/global-datacare/gw-core@sha256:e09bc2bc86d50cccdec57e9b5fa9862cd6404e10305b6b9c33073f2cc5c8b632</w:t>
       </w:r>
       <w:r>
         <w:rPr>
@@ -2131,7 +2131,7 @@
           <w:spacing w:val="0"/>
           <w:color w:val="181E2A"/>
         </w:rPr>
-        <w:t xml:space="preserve">export GW_PUBLIC_IMAGE="ghcr.io/global-datacare/gw-core@sha256:3c2c4eade8123d7e3b1a40fc5d32864dd685603dcbe09a9e44393f60864a626f"</w:t>
+        <w:t xml:space="preserve">export GW_PUBLIC_IMAGE="ghcr.io/global-datacare/gw-core@sha256:e09bc2bc86d50cccdec57e9b5fa9862cd6404e10305b6b9c33073f2cc5c8b632"</w:t>
       </w:r>
     </w:p>
     <w:p>

</xml_diff>

<commit_message>
docs: pin verified public runtime images
</commit_message>
<xml_diff>
--- a/deliverables/GUIA_HOST_REPRODUCIBLE_ES.docx
+++ b/deliverables/GUIA_HOST_REPRODUCIBLE_ES.docx
@@ -116,7 +116,7 @@
           <w:spacing w:val="0"/>
           <w:color w:val="181E2A"/>
         </w:rPr>
-        <w:t xml:space="preserve">ghcr.io/global-datacare/gw-core@sha256:e09bc2bc86d50cccdec57e9b5fa9862cd6404e10305b6b9c33073f2cc5c8b632</w:t>
+        <w:t xml:space="preserve">ghcr.io/global-datacare/gw-core@sha256:724ba328915d9907d7254c7eeded845d70dc1ae05881bccff630e871fbc7389f</w:t>
       </w:r>
       <w:r>
         <w:rPr>
@@ -2090,20 +2090,20 @@
           <w:spacing w:val="0"/>
           <w:color w:val="181E2A"/>
         </w:rPr>
-        <w:t xml:space="preserve">helm pull oci://ghcr.io/global-datacare/gdc-host --version 0.3.0</w:t>
-      </w:r>
-    </w:p>
-    <w:p>
-      <w:pPr/>
-      <w:r>
-        <w:rPr>
-          <w:rFonts w:ascii="Menlo" w:hAnsi="Menlo" w:cs="Menlo"/>
-          <w:sz w:val="26"/>
-          <w:sz-cs w:val="26"/>
-          <w:spacing w:val="0"/>
-          <w:color w:val="181E2A"/>
-        </w:rPr>
-        <w:t xml:space="preserve">helm show chart oci://ghcr.io/global-datacare/gdc-host --version 0.3.0</w:t>
+        <w:t xml:space="preserve">helm pull oci://ghcr.io/global-datacare/gdc-host --version 0.3.1</w:t>
+      </w:r>
+    </w:p>
+    <w:p>
+      <w:pPr/>
+      <w:r>
+        <w:rPr>
+          <w:rFonts w:ascii="Menlo" w:hAnsi="Menlo" w:cs="Menlo"/>
+          <w:sz w:val="26"/>
+          <w:sz-cs w:val="26"/>
+          <w:spacing w:val="0"/>
+          <w:color w:val="181E2A"/>
+        </w:rPr>
+        <w:t xml:space="preserve">helm show chart oci://ghcr.io/global-datacare/gdc-host --version 0.3.1</w:t>
       </w:r>
     </w:p>
     <w:p>
@@ -2131,7 +2131,7 @@
           <w:spacing w:val="0"/>
           <w:color w:val="181E2A"/>
         </w:rPr>
-        <w:t xml:space="preserve">export GW_PUBLIC_IMAGE="ghcr.io/global-datacare/gw-core@sha256:e09bc2bc86d50cccdec57e9b5fa9862cd6404e10305b6b9c33073f2cc5c8b632"</w:t>
+        <w:t xml:space="preserve">export GW_PUBLIC_IMAGE="ghcr.io/global-datacare/gw-core@sha256:724ba328915d9907d7254c7eeded845d70dc1ae05881bccff630e871fbc7389f"</w:t>
       </w:r>
     </w:p>
     <w:p>
@@ -2549,20 +2549,20 @@
           <w:spacing w:val="0"/>
           <w:color w:val="181E2A"/>
         </w:rPr>
-        <w:t xml:space="preserve">helm pull oci://ghcr.io/global-datacare/gdc-host --version 0.3.0</w:t>
-      </w:r>
-    </w:p>
-    <w:p>
-      <w:pPr/>
-      <w:r>
-        <w:rPr>
-          <w:rFonts w:ascii="Menlo" w:hAnsi="Menlo" w:cs="Menlo"/>
-          <w:sz w:val="26"/>
-          <w:sz-cs w:val="26"/>
-          <w:spacing w:val="0"/>
-          <w:color w:val="181E2A"/>
-        </w:rPr>
-        <w:t xml:space="preserve">tar -xzf gdc-host-0.3.0.tgz -C /secure/onboarding</w:t>
+        <w:t xml:space="preserve">helm pull oci://ghcr.io/global-datacare/gdc-host --version 0.3.1</w:t>
+      </w:r>
+    </w:p>
+    <w:p>
+      <w:pPr/>
+      <w:r>
+        <w:rPr>
+          <w:rFonts w:ascii="Menlo" w:hAnsi="Menlo" w:cs="Menlo"/>
+          <w:sz w:val="26"/>
+          <w:sz-cs w:val="26"/>
+          <w:spacing w:val="0"/>
+          <w:color w:val="181E2A"/>
+        </w:rPr>
+        <w:t xml:space="preserve">tar -xzf gdc-host-0.3.1.tgz -C /secure/onboarding</w:t>
       </w:r>
     </w:p>
     <w:p>

</xml_diff>

<commit_message>
docs: complete private host handoff contract
</commit_message>
<xml_diff>
--- a/deliverables/GUIA_HOST_REPRODUCIBLE_ES.docx
+++ b/deliverables/GUIA_HOST_REPRODUCIBLE_ES.docx
@@ -1743,7 +1743,258 @@
           <w:spacing w:val="0"/>
           <w:color w:val="181E2A"/>
         </w:rPr>
-        <w:t xml:space="preserve">El proveedor recibe únicamente el grant 0600 y la cadena TLS pública de Fabric CA. Las claves se crean en su infraestructura:</w:t>
+        <w:t xml:space="preserve">El proveedor recibe por un canal seguro un paquete privado cifrado. La identidad administradora del MSP, el registrador de Fabric CA, la Host VC-JWT, el PDF y el inventario completo de red quedan fuera de la entrega:</w:t>
+      </w:r>
+    </w:p>
+    <w:p>
+      <w:pPr/>
+      <w:r>
+        <w:rPr>
+          <w:rFonts w:ascii="Menlo" w:hAnsi="Menlo" w:cs="Menlo"/>
+          <w:sz w:val="26"/>
+          <w:sz-cs w:val="26"/>
+          <w:spacing w:val="0"/>
+          <w:color w:val="181E2A"/>
+        </w:rPr>
+        <w:t xml:space="preserve">peer-enrollment-grant.json</w:t>
+      </w:r>
+    </w:p>
+    <w:p>
+      <w:pPr/>
+      <w:r>
+        <w:rPr>
+          <w:rFonts w:ascii="Menlo" w:hAnsi="Menlo" w:cs="Menlo"/>
+          <w:sz w:val="26"/>
+          <w:sz-cs w:val="26"/>
+          <w:spacing w:val="0"/>
+          <w:color w:val="181E2A"/>
+        </w:rPr>
+        <w:t xml:space="preserve">gw-client-enrollment-grant.json</w:t>
+      </w:r>
+    </w:p>
+    <w:p>
+      <w:pPr/>
+      <w:r>
+        <w:rPr>
+          <w:rFonts w:ascii="Menlo" w:hAnsi="Menlo" w:cs="Menlo"/>
+          <w:sz w:val="26"/>
+          <w:sz-cs w:val="26"/>
+          <w:spacing w:val="0"/>
+          <w:color w:val="181E2A"/>
+        </w:rPr>
+        <w:t xml:space="preserve">fabric-ica-ca-chain.pem</w:t>
+      </w:r>
+    </w:p>
+    <w:p>
+      <w:pPr/>
+      <w:r>
+        <w:rPr>
+          <w:rFonts w:ascii="Menlo" w:hAnsi="Menlo" w:cs="Menlo"/>
+          <w:sz w:val="26"/>
+          <w:sz-cs w:val="26"/>
+          <w:spacing w:val="0"/>
+          <w:color w:val="181E2A"/>
+        </w:rPr>
+        <w:t xml:space="preserve">fabric-endpoints.json</w:t>
+      </w:r>
+    </w:p>
+    <w:p>
+      <w:pPr/>
+      <w:r>
+        <w:rPr>
+          <w:rFonts w:ascii="Menlo" w:hAnsi="Menlo" w:cs="Menlo"/>
+          <w:sz w:val="26"/>
+          <w:sz-cs w:val="26"/>
+          <w:spacing w:val="0"/>
+          <w:color w:val="181E2A"/>
+        </w:rPr>
+        <w:t xml:space="preserve">authorization.json</w:t>
+      </w:r>
+    </w:p>
+    <w:p>
+      <w:pPr/>
+      <w:r>
+        <w:rPr>
+          <w:rFonts w:ascii="Menlo" w:hAnsi="Menlo" w:cs="Menlo"/>
+          <w:sz w:val="26"/>
+          <w:sz-cs w:val="26"/>
+          <w:spacing w:val="0"/>
+          <w:color w:val="181E2A"/>
+        </w:rPr>
+        <w:t xml:space="preserve">host-apply-confirmation.json</w:t>
+      </w:r>
+    </w:p>
+    <w:p>
+      <w:pPr/>
+      <w:r>
+        <w:rPr>
+          <w:rFonts w:ascii="Menlo" w:hAnsi="Menlo" w:cs="Menlo"/>
+          <w:sz w:val="26"/>
+          <w:sz-cs w:val="26"/>
+          <w:spacing w:val="0"/>
+          <w:color w:val="181E2A"/>
+        </w:rPr>
+        <w:t xml:space="preserve">onboarding.host.json</w:t>
+      </w:r>
+    </w:p>
+    <w:p>
+      <w:pPr/>
+      <w:r>
+        <w:rPr>
+          <w:rFonts w:ascii="Menlo" w:hAnsi="Menlo" w:cs="Menlo"/>
+          <w:sz w:val="26"/>
+          <w:sz-cs w:val="26"/>
+          <w:spacing w:val="0"/>
+          <w:color w:val="181E2A"/>
+        </w:rPr>
+        <w:t xml:space="preserve">manifest.sha256</w:t>
+      </w:r>
+    </w:p>
+    <w:p>
+      <w:pPr>
+        <w:spacing w:after="240"/>
+      </w:pPr>
+      <w:r>
+        <w:rPr>
+          <w:rFonts w:ascii="Arial" w:hAnsi="Arial" w:cs="Arial"/>
+          <w:sz w:val="24"/>
+          <w:sz-cs w:val="24"/>
+          <w:spacing w:val="0"/>
+          <w:color w:val="181E2A"/>
+        </w:rPr>
+        <w:t xml:space="preserve">Los grants son secretos temporales. </w:t>
+      </w:r>
+      <w:r>
+        <w:rPr>
+          <w:rFonts w:ascii="Menlo" w:hAnsi="Menlo" w:cs="Menlo"/>
+          <w:sz w:val="26"/>
+          <w:sz-cs w:val="26"/>
+          <w:spacing w:val="0"/>
+          <w:color w:val="181E2A"/>
+        </w:rPr>
+        <w:t xml:space="preserve">authorization.json</w:t>
+      </w:r>
+      <w:r>
+        <w:rPr>
+          <w:rFonts w:ascii="Arial" w:hAnsi="Arial" w:cs="Arial"/>
+          <w:sz w:val="24"/>
+          <w:sz-cs w:val="24"/>
+          <w:spacing w:val="0"/>
+          <w:color w:val="181E2A"/>
+        </w:rPr>
+        <w:t xml:space="preserve"> es el resultado saneado, </w:t>
+      </w:r>
+      <w:r>
+        <w:rPr>
+          <w:rFonts w:ascii="Menlo" w:hAnsi="Menlo" w:cs="Menlo"/>
+          <w:sz w:val="26"/>
+          <w:sz-cs w:val="26"/>
+          <w:spacing w:val="0"/>
+          <w:color w:val="181E2A"/>
+        </w:rPr>
+        <w:t xml:space="preserve">host-apply-confirmation.json</w:t>
+      </w:r>
+      <w:r>
+        <w:rPr>
+          <w:rFonts w:ascii="Arial" w:hAnsi="Arial" w:cs="Arial"/>
+          <w:sz w:val="24"/>
+          <w:sz-cs w:val="24"/>
+          <w:spacing w:val="0"/>
+          <w:color w:val="181E2A"/>
+        </w:rPr>
+        <w:t xml:space="preserve"> proporciona el </w:t>
+      </w:r>
+      <w:r>
+        <w:rPr>
+          <w:rFonts w:ascii="Menlo" w:hAnsi="Menlo" w:cs="Menlo"/>
+          <w:sz w:val="26"/>
+          <w:sz-cs w:val="26"/>
+          <w:spacing w:val="0"/>
+          <w:color w:val="181E2A"/>
+        </w:rPr>
+        <w:t xml:space="preserve">requestId</w:t>
+      </w:r>
+      <w:r>
+        <w:rPr>
+          <w:rFonts w:ascii="Arial" w:hAnsi="Arial" w:cs="Arial"/>
+          <w:sz w:val="24"/>
+          <w:sz-cs w:val="24"/>
+          <w:spacing w:val="0"/>
+          <w:color w:val="181E2A"/>
+        </w:rPr>
+        <w:t xml:space="preserve"> y </w:t>
+      </w:r>
+      <w:r>
+        <w:rPr>
+          <w:rFonts w:ascii="Menlo" w:hAnsi="Menlo" w:cs="Menlo"/>
+          <w:sz w:val="26"/>
+          <w:sz-cs w:val="26"/>
+          <w:spacing w:val="0"/>
+          <w:color w:val="181E2A"/>
+        </w:rPr>
+        <w:t xml:space="preserve">onboarding.host.json</w:t>
+      </w:r>
+      <w:r>
+        <w:rPr>
+          <w:rFonts w:ascii="Arial" w:hAnsi="Arial" w:cs="Arial"/>
+          <w:sz w:val="24"/>
+          <w:sz-cs w:val="24"/>
+          <w:spacing w:val="0"/>
+          <w:color w:val="181E2A"/>
+        </w:rPr>
+        <w:t xml:space="preserve"> fija las rutas del rol del host. El proveedor comprueba los hashes antes de generar sus claves:</w:t>
+      </w:r>
+    </w:p>
+    <w:p>
+      <w:pPr/>
+      <w:r>
+        <w:rPr>
+          <w:rFonts w:ascii="Menlo" w:hAnsi="Menlo" w:cs="Menlo"/>
+          <w:sz w:val="26"/>
+          <w:sz-cs w:val="26"/>
+          <w:spacing w:val="0"/>
+          <w:color w:val="181E2A"/>
+        </w:rPr>
+        <w:t xml:space="preserve">cd /secure/onboarding</w:t>
+      </w:r>
+    </w:p>
+    <w:p>
+      <w:pPr/>
+      <w:r>
+        <w:rPr>
+          <w:rFonts w:ascii="Menlo" w:hAnsi="Menlo" w:cs="Menlo"/>
+          <w:sz w:val="26"/>
+          <w:sz-cs w:val="26"/>
+          <w:spacing w:val="0"/>
+          <w:color w:val="181E2A"/>
+        </w:rPr>
+        <w:t xml:space="preserve">shasum -a 256 -c manifest.sha256</w:t>
+      </w:r>
+    </w:p>
+    <w:p>
+      <w:pPr/>
+      <w:r>
+        <w:rPr>
+          <w:rFonts w:ascii="Menlo" w:hAnsi="Menlo" w:cs="Menlo"/>
+          <w:sz w:val="26"/>
+          <w:sz-cs w:val="26"/>
+          <w:spacing w:val="0"/>
+          <w:color w:val="181E2A"/>
+        </w:rPr>
+        <w:t xml:space="preserve">request_id="$(jq -r '.governanceDecision.decision.requestId' \</w:t>
+      </w:r>
+    </w:p>
+    <w:p>
+      <w:pPr/>
+      <w:r>
+        <w:rPr>
+          <w:rFonts w:ascii="Menlo" w:hAnsi="Menlo" w:cs="Menlo"/>
+          <w:sz w:val="26"/>
+          <w:sz-cs w:val="26"/>
+          <w:spacing w:val="0"/>
+          <w:color w:val="181E2A"/>
+        </w:rPr>
+        <w:t xml:space="preserve">  host-apply-confirmation.json)"</w:t>
       </w:r>
     </w:p>
     <w:p>
@@ -1769,7 +2020,7 @@
           <w:spacing w:val="0"/>
           <w:color w:val="181E2A"/>
         </w:rPr>
-        <w:t xml:space="preserve">  --manifest /secure/onboarding/onboarding.json --role host</w:t>
+        <w:t xml:space="preserve">  --manifest /secure/onboarding/onboarding.host.json --role host</w:t>
       </w:r>
     </w:p>
     <w:p>
@@ -1795,7 +2046,7 @@
           <w:spacing w:val="0"/>
           <w:color w:val="181E2A"/>
         </w:rPr>
-        <w:t xml:space="preserve">  --manifest /secure/onboarding/onboarding.json --role host \</w:t>
+        <w:t xml:space="preserve">  --manifest /secure/onboarding/onboarding.host.json --role host \</w:t>
       </w:r>
     </w:p>
     <w:p>
@@ -2090,20 +2341,20 @@
           <w:spacing w:val="0"/>
           <w:color w:val="181E2A"/>
         </w:rPr>
-        <w:t xml:space="preserve">helm pull oci://ghcr.io/global-datacare/gdc-host --version 0.3.1</w:t>
-      </w:r>
-    </w:p>
-    <w:p>
-      <w:pPr/>
-      <w:r>
-        <w:rPr>
-          <w:rFonts w:ascii="Menlo" w:hAnsi="Menlo" w:cs="Menlo"/>
-          <w:sz w:val="26"/>
-          <w:sz-cs w:val="26"/>
-          <w:spacing w:val="0"/>
-          <w:color w:val="181E2A"/>
-        </w:rPr>
-        <w:t xml:space="preserve">helm show chart oci://ghcr.io/global-datacare/gdc-host --version 0.3.1</w:t>
+        <w:t xml:space="preserve">helm pull oci://ghcr.io/global-datacare/gdc-host --version 0.3.2</w:t>
+      </w:r>
+    </w:p>
+    <w:p>
+      <w:pPr/>
+      <w:r>
+        <w:rPr>
+          <w:rFonts w:ascii="Menlo" w:hAnsi="Menlo" w:cs="Menlo"/>
+          <w:sz w:val="26"/>
+          <w:sz-cs w:val="26"/>
+          <w:spacing w:val="0"/>
+          <w:color w:val="181E2A"/>
+        </w:rPr>
+        <w:t xml:space="preserve">helm show chart oci://ghcr.io/global-datacare/gdc-host --version 0.3.2</w:t>
       </w:r>
     </w:p>
     <w:p>
@@ -2549,20 +2800,20 @@
           <w:spacing w:val="0"/>
           <w:color w:val="181E2A"/>
         </w:rPr>
-        <w:t xml:space="preserve">helm pull oci://ghcr.io/global-datacare/gdc-host --version 0.3.1</w:t>
-      </w:r>
-    </w:p>
-    <w:p>
-      <w:pPr/>
-      <w:r>
-        <w:rPr>
-          <w:rFonts w:ascii="Menlo" w:hAnsi="Menlo" w:cs="Menlo"/>
-          <w:sz w:val="26"/>
-          <w:sz-cs w:val="26"/>
-          <w:spacing w:val="0"/>
-          <w:color w:val="181E2A"/>
-        </w:rPr>
-        <w:t xml:space="preserve">tar -xzf gdc-host-0.3.1.tgz -C /secure/onboarding</w:t>
+        <w:t xml:space="preserve">helm pull oci://ghcr.io/global-datacare/gdc-host --version 0.3.2</w:t>
+      </w:r>
+    </w:p>
+    <w:p>
+      <w:pPr/>
+      <w:r>
+        <w:rPr>
+          <w:rFonts w:ascii="Menlo" w:hAnsi="Menlo" w:cs="Menlo"/>
+          <w:sz w:val="26"/>
+          <w:sz-cs w:val="26"/>
+          <w:spacing w:val="0"/>
+          <w:color w:val="181E2A"/>
+        </w:rPr>
+        <w:t xml:space="preserve">tar -xzf gdc-host-0.3.2.tgz -C /secure/onboarding</w:t>
       </w:r>
     </w:p>
     <w:p>

</xml_diff>

<commit_message>
docs: publish bilingual host onboarding deliverables
</commit_message>
<xml_diff>
--- a/deliverables/GUIA_HOST_REPRODUCIBLE_ES.docx
+++ b/deliverables/GUIA_HOST_REPRODUCIBLE_ES.docx
@@ -950,7 +950,7 @@
           <w:spacing w:val="0"/>
           <w:color w:val="181E2A"/>
         </w:rPr>
-        <w:t xml:space="preserve">Imágenes y autoridades locales, DNS .localhost y StorageClass de kind.</w:t>
+        <w:t xml:space="preserve">Imágenes e ICAs locales, DNS .localhost y StorageClass de kind.</w:t>
       </w:r>
     </w:p>
     <w:p>
@@ -989,7 +989,7 @@
           <w:spacing w:val="0"/>
           <w:color w:val="181E2A"/>
         </w:rPr>
-        <w:t xml:space="preserve">Digests publicados, autoridades de staging, DNS/TLS y almacenamiento cloud.</w:t>
+        <w:t xml:space="preserve">Digests publicados, ICAs de staging, DNS/TLS y almacenamiento cloud.</w:t>
       </w:r>
     </w:p>
     <w:p>
@@ -1028,7 +1028,7 @@
           <w:spacing w:val="0"/>
           <w:color w:val="181E2A"/>
         </w:rPr>
-        <w:t xml:space="preserve">Host VC y certificados nuevos, digests aprobados, KMS y values del proveedor.</w:t>
+        <w:t xml:space="preserve">Host VC y certificados nuevos, digests aprobados, KMS y values del Nodo Operador.</w:t>
       </w:r>
     </w:p>
     <w:p>
@@ -1074,7 +1074,7 @@
           <w:spacing w:val="0"/>
           <w:color w:val="181E2A"/>
         </w:rPr>
-        <w:t xml:space="preserve">Helm no crea la red Fabric, no actúa como administrador de ninguna ICA y no decide qué MSP entra en los canales. Antes de instalar un host autónomo deben existir la autorización, el grant de enrolamiento, el material MSP/TLS generado por el host, la incorporación gobernada a los canales y los Secrets Kubernetes. La reconciliación privilegiada se ejecuta por la autoridad.</w:t>
+        <w:t xml:space="preserve">Helm no crea la red Fabric, no actúa como administrador de ninguna ICA y no decide qué MSP entra en los canales. Antes de instalar un host autónomo deben existir la autorización, el grant de enrolamiento, el material MSP/TLS generado por el host, la incorporación gobernada a los canales y los Secrets Kubernetes. La reconciliación privilegiada la ejecuta el equipo DevOps de Fabric.</w:t>
       </w:r>
     </w:p>
     <w:p>
@@ -1129,7 +1129,187 @@
           <w:spacing w:val="0"/>
           <w:color w:val="181E2A"/>
         </w:rPr>
-        <w:t xml:space="preserve">; la autoridad debe revocar el identificador no consumido porque Fabric CA garantiza el límite de usos, no esa fecha.</w:t>
+        <w:t xml:space="preserve">; el equipo DevOps de Fabric debe revocar el identificador no consumido porque la ICA de Fabric aplica el límite de usos, no esa fecha.</w:t>
+      </w:r>
+    </w:p>
+    <w:p>
+      <w:pPr>
+        <w:spacing w:after="240"/>
+      </w:pPr>
+      <w:r>
+        <w:rPr>
+          <w:rFonts w:ascii="Arial" w:hAnsi="Arial" w:cs="Arial"/>
+          <w:sz w:val="24"/>
+          <w:sz-cs w:val="24"/>
+          <w:spacing w:val="0"/>
+          <w:color w:val="181E2A"/>
+        </w:rPr>
+        <w:t xml:space="preserve">Esta guía utiliza </w:t>
+      </w:r>
+      <w:r>
+        <w:rPr>
+          <w:rFonts w:ascii="Arial" w:hAnsi="Arial" w:cs="Arial"/>
+          <w:sz w:val="24"/>
+          <w:sz-cs w:val="24"/>
+          <w:b/>
+          <w:spacing w:val="0"/>
+          <w:color w:val="181E2A"/>
+        </w:rPr>
+        <w:t xml:space="preserve">Nodo Operador, que actúa como Proveedor de Alojamiento para alojar organizaciones proveedoras o consumidoras de servicios de índice o de gemelos digitales</w:t>
+      </w:r>
+      <w:r>
+        <w:rPr>
+          <w:rFonts w:ascii="Arial" w:hAnsi="Arial" w:cs="Arial"/>
+          <w:sz w:val="24"/>
+          <w:sz-cs w:val="24"/>
+          <w:spacing w:val="0"/>
+          <w:color w:val="181E2A"/>
+        </w:rPr>
+        <w:t xml:space="preserve">, con el significado definido en el Rulebook: la infraestructura técnica acreditada que aloja participantes y presta servicios en el Espacio. El </w:t>
+      </w:r>
+      <w:r>
+        <w:rPr>
+          <w:rFonts w:ascii="Arial" w:hAnsi="Arial" w:cs="Arial"/>
+          <w:sz w:val="24"/>
+          <w:sz-cs w:val="24"/>
+          <w:b/>
+          <w:spacing w:val="0"/>
+          <w:color w:val="181E2A"/>
+        </w:rPr>
+        <w:t xml:space="preserve">equipo DevOps del Nodo Operador</w:t>
+      </w:r>
+      <w:r>
+        <w:rPr>
+          <w:rFonts w:ascii="Arial" w:hAnsi="Arial" w:cs="Arial"/>
+          <w:sz w:val="24"/>
+          <w:sz-cs w:val="24"/>
+          <w:spacing w:val="0"/>
+          <w:color w:val="181E2A"/>
+        </w:rPr>
+        <w:t xml:space="preserve"> ejecuta los comandos de despliegue y operación.</w:t>
+      </w:r>
+    </w:p>
+    <w:p>
+      <w:pPr>
+        <w:spacing w:after="240"/>
+      </w:pPr>
+      <w:r>
+        <w:rPr>
+          <w:rFonts w:ascii="Arial" w:hAnsi="Arial" w:cs="Arial"/>
+          <w:sz w:val="24"/>
+          <w:sz-cs w:val="24"/>
+          <w:spacing w:val="0"/>
+          <w:color w:val="181E2A"/>
+        </w:rPr>
+        <w:t xml:space="preserve">La </w:t>
+      </w:r>
+      <w:r>
+        <w:rPr>
+          <w:rFonts w:ascii="Arial" w:hAnsi="Arial" w:cs="Arial"/>
+          <w:sz w:val="24"/>
+          <w:sz-cs w:val="24"/>
+          <w:b/>
+          <w:spacing w:val="0"/>
+          <w:color w:val="181E2A"/>
+        </w:rPr>
+        <w:t xml:space="preserve">identidad registradora de la ICA de Fabric</w:t>
+      </w:r>
+      <w:r>
+        <w:rPr>
+          <w:rFonts w:ascii="Arial" w:hAnsi="Arial" w:cs="Arial"/>
+          <w:sz w:val="24"/>
+          <w:sz-cs w:val="24"/>
+          <w:spacing w:val="0"/>
+          <w:color w:val="181E2A"/>
+        </w:rPr>
+        <w:t xml:space="preserve"> y el </w:t>
+      </w:r>
+      <w:r>
+        <w:rPr>
+          <w:rFonts w:ascii="Arial" w:hAnsi="Arial" w:cs="Arial"/>
+          <w:sz w:val="24"/>
+          <w:sz-cs w:val="24"/>
+          <w:b/>
+          <w:spacing w:val="0"/>
+          <w:color w:val="181E2A"/>
+        </w:rPr>
+        <w:t xml:space="preserve">administrador del MSP</w:t>
+      </w:r>
+      <w:r>
+        <w:rPr>
+          <w:rFonts w:ascii="Arial" w:hAnsi="Arial" w:cs="Arial"/>
+          <w:sz w:val="24"/>
+          <w:sz-cs w:val="24"/>
+          <w:spacing w:val="0"/>
+          <w:color w:val="181E2A"/>
+        </w:rPr>
+        <w:t xml:space="preserve"> son identidades diferentes. Ambas son </w:t>
+      </w:r>
+      <w:r>
+        <w:rPr>
+          <w:rFonts w:ascii="Arial" w:hAnsi="Arial" w:cs="Arial"/>
+          <w:sz w:val="24"/>
+          <w:sz-cs w:val="24"/>
+          <w:b/>
+          <w:spacing w:val="0"/>
+          <w:color w:val="181E2A"/>
+        </w:rPr>
+        <w:t xml:space="preserve">identidades administrativas de Fabric</w:t>
+      </w:r>
+      <w:r>
+        <w:rPr>
+          <w:rFonts w:ascii="Arial" w:hAnsi="Arial" w:cs="Arial"/>
+          <w:sz w:val="24"/>
+          <w:sz-cs w:val="24"/>
+          <w:spacing w:val="0"/>
+          <w:color w:val="181E2A"/>
+        </w:rPr>
+        <w:t xml:space="preserve">. La primera registra los identificadores de enrolamiento en la ICA de Fabric; la segunda administra el MSP en las operaciones autorizadas de configuración y lifecycle. La entidad autorizada para administrar Fabric custodia ambas identidades y el equipo DevOps de Fabric las utiliza para ejecutar las operaciones aprobadas. El equipo DevOps del Nodo Operador no recibe ninguna de las dos: solo recibe los grants temporales.</w:t>
+      </w:r>
+    </w:p>
+    <w:p>
+      <w:pPr>
+        <w:spacing w:after="240"/>
+      </w:pPr>
+      <w:r>
+        <w:rPr>
+          <w:rFonts w:ascii="Arial" w:hAnsi="Arial" w:cs="Arial"/>
+          <w:sz w:val="24"/>
+          <w:sz-cs w:val="24"/>
+          <w:spacing w:val="0"/>
+          <w:color w:val="181E2A"/>
+        </w:rPr>
+        <w:t xml:space="preserve">Un grant temporal de enrolamiento no es un certificado. Contiene el identificador y el secreto temporales necesarios para solicitarlo a la ICA de Fabric. Al consumir el grant, la clave privada se genera dentro del Nodo Operador y la ICA de Fabric devuelve el certificado X.509. El grant del peer permite los enrolamientos MSP y TLS; el grant del cliente GW permite su enrolamiento MSP. Ninguno incorpora por sí solo el peer a los canales.</w:t>
+      </w:r>
+    </w:p>
+    <w:p>
+      <w:pPr>
+        <w:spacing w:after="240"/>
+      </w:pPr>
+      <w:r>
+        <w:rPr>
+          <w:rFonts w:ascii="Arial" w:hAnsi="Arial" w:cs="Arial"/>
+          <w:sz w:val="24"/>
+          <w:sz-cs w:val="24"/>
+          <w:spacing w:val="0"/>
+          <w:color w:val="181E2A"/>
+        </w:rPr>
+        <w:t xml:space="preserve">La ICA de Fabric devuelve directamente los certificados al Nodo Operador. No pasan por el equipo DevOps de Fabric.</w:t>
+      </w:r>
+    </w:p>
+    <w:p>
+      <w:pPr>
+        <w:spacing w:after="240"/>
+      </w:pPr>
+      <w:r>
+        <w:rPr>
+          <w:rFonts w:ascii="Arial" w:hAnsi="Arial" w:cs="Arial"/>
+          <w:sz w:val="24"/>
+          <w:sz-cs w:val="24"/>
+          <w:spacing w:val="0"/>
+          <w:color w:val="181E2A"/>
+        </w:rPr>
+        <w:t xml:space="preserve">Conforme a la sección 10.4 del Rulebook, el Nodo Operador debe demostrar capacidad técnica, mecanismos de identidad y confianza, publicación de artefactos y controles de Compute to Data cuando apliquen. Su habilitación exige la validación del Operador del Espacio cuando esté designado o, en su defecto, del Nodo Operador anfitrión y la ICA correspondiente. La sección 13.3 le atribuye las obligaciones contractuales y normativas sobre seguridad, disponibilidad de la infraestructura y protección de datos.</w:t>
       </w:r>
     </w:p>
     <w:p>
@@ -1145,7 +1325,7 @@
           <w:spacing w:val="0"/>
           <w:color w:val="15486C"/>
         </w:rPr>
-        <w:t xml:space="preserve">7. Datos requeridos al proveedor</w:t>
+        <w:t xml:space="preserve">7. Datos requeridos al equipo DevOps del Nodo Operador</w:t>
       </w:r>
     </w:p>
     <w:p>
@@ -1332,7 +1512,7 @@
           <w:spacing w:val="0"/>
           <w:color w:val="15486C"/>
         </w:rPr>
-        <w:t xml:space="preserve">9. Prueba completa del auditor</w:t>
+        <w:t xml:space="preserve">9. Validación reproducible completa en local-network</w:t>
       </w:r>
     </w:p>
     <w:p>
@@ -1464,7 +1644,7 @@
           <w:spacing w:val="0"/>
           <w:color w:val="181E2A"/>
         </w:rPr>
-        <w:t xml:space="preserve">El auditor conserva el directorio anunciado bajo </w:t>
+        <w:t xml:space="preserve">El equipo que ejecuta la validación conserva el directorio anunciado bajo </w:t>
       </w:r>
       <w:r>
         <w:rPr>
@@ -1570,7 +1750,7 @@
           <w:spacing w:val="0"/>
           <w:color w:val="181E2A"/>
         </w:rPr>
-        <w:t xml:space="preserve">La ICA de Fabric se usa para altas, renovaciones y revocaciones, no para el tráfico normal de peers y orderers. La autoridad puede publicar una ventana TLS limitada a la IP de salida del proveedor y cerrarla después. El proveedor recibe URL, nombre de CA y cadena pública, pero nunca la identidad registradora de la ICA de Fabric. Antes del enrolamiento verifica:</w:t>
+        <w:t xml:space="preserve">La ICA de Fabric se usa para altas, renovaciones y revocaciones, no para el tráfico normal de peers y orderers. El equipo DevOps de Fabric puede publicar una ventana TLS limitada a la IP de salida del Nodo Operador y cerrarla después. El equipo DevOps del Nodo Operador recibe URL, nombre de CA y cadena pública, pero nunca la identidad registradora de la ICA de Fabric. Antes del enrolamiento verifica:</w:t>
       </w:r>
     </w:p>
     <w:p>
@@ -1637,7 +1817,7 @@
           <w:spacing w:val="0"/>
           <w:color w:val="181E2A"/>
         </w:rPr>
-        <w:t xml:space="preserve">La autoridad recibe por canal seguro la petición con URL, MSP, Host VC-JWT, decisión firmada, DID públicos, JWKS e inventario gobernado. Ejecuta:</w:t>
+        <w:t xml:space="preserve">El equipo DevOps de Fabric recibe por canal seguro la petición con URL, MSP, Host VC-JWT, decisión firmada, DID públicos, JWKS e inventario gobernado. Ejecuta:</w:t>
       </w:r>
     </w:p>
     <w:p>
@@ -1743,7 +1923,7 @@
           <w:spacing w:val="0"/>
           <w:color w:val="181E2A"/>
         </w:rPr>
-        <w:t xml:space="preserve">El proveedor recibe por un canal seguro un paquete privado cifrado. La identidad administradora del MSP, el registrador de Fabric CA, la Host VC-JWT, el PDF y el inventario completo de red quedan fuera de la entrega:</w:t>
+        <w:t xml:space="preserve">El equipo DevOps del Nodo Operador recibe por un canal seguro un paquete privado cifrado. El administrador del MSP, la identidad registradora de la ICA de Fabric, la Host VC-JWT, el PDF y el inventario completo de red quedan fuera de la entrega:</w:t>
       </w:r>
     </w:p>
     <w:p>
@@ -1942,7 +2122,7 @@
           <w:spacing w:val="0"/>
           <w:color w:val="181E2A"/>
         </w:rPr>
-        <w:t xml:space="preserve"> fija las rutas del rol del host. El proveedor comprueba los hashes antes de generar sus claves:</w:t>
+        <w:t xml:space="preserve"> fija las rutas del rol del host. El equipo DevOps del Nodo Operador comprueba los hashes antes de generar sus claves:</w:t>
       </w:r>
     </w:p>
     <w:p>
@@ -2100,7 +2280,7 @@
           <w:spacing w:val="0"/>
           <w:color w:val="181E2A"/>
         </w:rPr>
-        <w:t xml:space="preserve">Para auditar los dos enrolamientos por separado se usan los mismos helpers con variables explícitas:</w:t>
+        <w:t xml:space="preserve">Para validar los dos enrolamientos por separado se usan los mismos helpers con variables explícitas:</w:t>
       </w:r>
     </w:p>
     <w:p>
@@ -3041,7 +3221,7 @@
           <w:spacing w:val="0"/>
           <w:color w:val="181E2A"/>
         </w:rPr>
-        <w:t xml:space="preserve">El mapa privado del operador contiene comandos reales de inspección y aplicación para MSP, grants, peer, canales y lifecycle CCAAS. Si falta uno, el reconciliador falla cerrado. La aceptación prueba escritura/lectura por el peer propio, permiso/denegación y persistencia tras reiniciar GW, peer y CCAAS; un pod arrancado no basta.</w:t>
+        <w:t xml:space="preserve">El mapa privado del equipo DevOps de Fabric contiene comandos reales de inspección y aplicación para MSP, grants, peer, canales y lifecycle CCAAS. Si falta uno, el reconciliador falla cerrado. La aceptación prueba escritura/lectura por el peer propio, permiso/denegación y persistencia tras reiniciar GW, peer y CCAAS; un pod arrancado no basta.</w:t>
       </w:r>
     </w:p>
     <w:p>
@@ -3072,7 +3252,7 @@
           <w:spacing w:val="0"/>
           <w:color w:val="181E2A"/>
         </w:rPr>
-        <w:t xml:space="preserve">Commit, digest OCI, chart, values saneado, versiones, gates, logs saneados, auditoría y manifiesto de hashes. Los datos reales del proveedor se mantienen en un anexo privado. La prueba local demuestra reproducibilidad del software; no declara desplegada una infraestructura externa concreta.</w:t>
+        <w:t xml:space="preserve">Commit, digest OCI, chart, values saneado, versiones, gates, logs saneados, auditoría y manifiesto de hashes. Los datos reales del Nodo Operador se mantienen en un anexo privado. La prueba local demuestra reproducibilidad del software; no declara desplegada una infraestructura externa concreta.</w:t>
       </w:r>
     </w:p>
     <w:sectPr/>

</xml_diff>

<commit_message>
docs: pin 1.25.0 runtime digests
</commit_message>
<xml_diff>
--- a/deliverables/GUIA_HOST_REPRODUCIBLE_ES.docx
+++ b/deliverables/GUIA_HOST_REPRODUCIBLE_ES.docx
@@ -116,7 +116,7 @@
           <w:spacing w:val="0"/>
           <w:color w:val="181E2A"/>
         </w:rPr>
-        <w:t xml:space="preserve">ghcr.io/global-datacare/gw-core@sha256:724ba328915d9907d7254c7eeded845d70dc1ae05881bccff630e871fbc7389f</w:t>
+        <w:t xml:space="preserve">ghcr.io/global-datacare/gw-core@sha256:e08eb3482e8e6df812269ba72c14d7831c2cdc331fe7bc6836a606b4e2e96a71</w:t>
       </w:r>
       <w:r>
         <w:rPr>
@@ -185,7 +185,7 @@
           <w:spacing w:val="0"/>
           <w:color w:val="181E2A"/>
         </w:rPr>
-        <w:t xml:space="preserve">ghcr.io/global-datacare/host-runtime@sha256:67e5c0fb93efbdc79812a3579ea0b9b0d8e230fca8d430c72e81666a7389f7ac</w:t>
+        <w:t xml:space="preserve">ghcr.io/global-datacare/host-runtime@sha256:0742ce44f2c56b8a559ed872620c779adaac64c6e1b476d3fda1762f0d2fe510</w:t>
       </w:r>
       <w:r>
         <w:rPr>
@@ -2562,20 +2562,20 @@
           <w:spacing w:val="0"/>
           <w:color w:val="181E2A"/>
         </w:rPr>
-        <w:t xml:space="preserve">export GW_PUBLIC_IMAGE="ghcr.io/global-datacare/gw-core@sha256:724ba328915d9907d7254c7eeded845d70dc1ae05881bccff630e871fbc7389f"</w:t>
-      </w:r>
-    </w:p>
-    <w:p>
-      <w:pPr/>
-      <w:r>
-        <w:rPr>
-          <w:rFonts w:ascii="Menlo" w:hAnsi="Menlo" w:cs="Menlo"/>
-          <w:sz w:val="26"/>
-          <w:sz-cs w:val="26"/>
-          <w:spacing w:val="0"/>
-          <w:color w:val="181E2A"/>
-        </w:rPr>
-        <w:t xml:space="preserve">export CCAAS_PUBLIC_IMAGE="ghcr.io/global-datacare/host-runtime@sha256:67e5c0fb93efbdc79812a3579ea0b9b0d8e230fca8d430c72e81666a7389f7ac"</w:t>
+        <w:t xml:space="preserve">export GW_PUBLIC_IMAGE="ghcr.io/global-datacare/gw-core@sha256:e08eb3482e8e6df812269ba72c14d7831c2cdc331fe7bc6836a606b4e2e96a71"</w:t>
+      </w:r>
+    </w:p>
+    <w:p>
+      <w:pPr/>
+      <w:r>
+        <w:rPr>
+          <w:rFonts w:ascii="Menlo" w:hAnsi="Menlo" w:cs="Menlo"/>
+          <w:sz w:val="26"/>
+          <w:sz-cs w:val="26"/>
+          <w:spacing w:val="0"/>
+          <w:color w:val="181E2A"/>
+        </w:rPr>
+        <w:t xml:space="preserve">export CCAAS_PUBLIC_IMAGE="ghcr.io/global-datacare/host-runtime@sha256:0742ce44f2c56b8a559ed872620c779adaac64c6e1b476d3fda1762f0d2fe510"</w:t>
       </w:r>
     </w:p>
     <w:p>

</xml_diff>